<commit_message>
feat(studio): contextual bar merge/unmerge and context menu style copy/paste
</commit_message>
<xml_diff>
--- a/docs/ui/Presserdiado_UX_Kilavuzu.docx
+++ b/docs/ui/Presserdiado_UX_Kilavuzu.docx
@@ -2228,7 +2228,16 @@
                 <w:sz w:val="20"/>
                 <w:szCs w:val="20"/>
               </w:rPr>
-              <w:t>500</w:t>
+              <w:t>4</w:t>
+            </w:r>
+            <w:r>
+              <w:rPr>
+                <w:rFonts w:ascii="Courier New" w:eastAsia="Courier New" w:hAnsi="Courier New" w:cs="Courier New"/>
+                <w:color w:val="475569"/>
+                <w:sz w:val="20"/>
+                <w:szCs w:val="20"/>
+              </w:rPr>
+              <w:t>00</w:t>
             </w:r>
           </w:p>
         </w:tc>

</xml_diff>

<commit_message>
feat(topbar): 3-grup layout + ZoomWidget + Dışa Aktar rename
</commit_message>
<xml_diff>
--- a/docs/ui/Presserdiado_UX_Kilavuzu.docx
+++ b/docs/ui/Presserdiado_UX_Kilavuzu.docx
@@ -6,6 +6,7 @@
       <w:pPr>
         <w:spacing w:before="1800" w:after="120"/>
       </w:pPr>
+      <w:proofErr w:type="spellStart"/>
       <w:r>
         <w:rPr>
           <w:b/>
@@ -16,6 +17,7 @@
         </w:rPr>
         <w:t>Presserdiado</w:t>
       </w:r>
+      <w:proofErr w:type="spellEnd"/>
     </w:p>
     <w:p>
       <w:pPr>
@@ -61,7 +63,21 @@
         <w:rPr>
           <w:color w:val="475569"/>
         </w:rPr>
-        <w:t>İkincil kullanıcı: Ajanslar ve freelancer tasarımcılar</w:t>
+        <w:t xml:space="preserve">İkincil kullanıcı: Ajanslar ve </w:t>
+      </w:r>
+      <w:proofErr w:type="spellStart"/>
+      <w:r>
+        <w:rPr>
+          <w:color w:val="475569"/>
+        </w:rPr>
+        <w:t>freelancer</w:t>
+      </w:r>
+      <w:proofErr w:type="spellEnd"/>
+      <w:r>
+        <w:rPr>
+          <w:color w:val="475569"/>
+        </w:rPr>
+        <w:t xml:space="preserve"> tasarımcılar</w:t>
       </w:r>
     </w:p>
     <w:p>
@@ -72,7 +88,35 @@
         <w:rPr>
           <w:color w:val="475569"/>
         </w:rPr>
-        <w:t>Uygulama: Web-to-print katalog ve broşür tasarım stüdyosu</w:t>
+        <w:t>Uygulama: Web-</w:t>
+      </w:r>
+      <w:proofErr w:type="spellStart"/>
+      <w:r>
+        <w:rPr>
+          <w:color w:val="475569"/>
+        </w:rPr>
+        <w:t>to</w:t>
+      </w:r>
+      <w:proofErr w:type="spellEnd"/>
+      <w:r>
+        <w:rPr>
+          <w:color w:val="475569"/>
+        </w:rPr>
+        <w:t>-</w:t>
+      </w:r>
+      <w:proofErr w:type="spellStart"/>
+      <w:r>
+        <w:rPr>
+          <w:color w:val="475569"/>
+        </w:rPr>
+        <w:t>print</w:t>
+      </w:r>
+      <w:proofErr w:type="spellEnd"/>
+      <w:r>
+        <w:rPr>
+          <w:color w:val="475569"/>
+        </w:rPr>
+        <w:t xml:space="preserve"> katalog ve broşür tasarım stüdyosu</w:t>
       </w:r>
     </w:p>
     <w:p>
@@ -90,7 +134,25 @@
           <w:iCs/>
           <w:color w:val="475569"/>
         </w:rPr>
-        <w:t>Versiyon 2.0  ·  Mayıs 2026</w:t>
+        <w:t xml:space="preserve">Versiyon </w:t>
+      </w:r>
+      <w:proofErr w:type="gramStart"/>
+      <w:r>
+        <w:rPr>
+          <w:i/>
+          <w:iCs/>
+          <w:color w:val="475569"/>
+        </w:rPr>
+        <w:t>2.0  ·</w:t>
+      </w:r>
+      <w:proofErr w:type="gramEnd"/>
+      <w:r>
+        <w:rPr>
+          <w:i/>
+          <w:iCs/>
+          <w:color w:val="475569"/>
+        </w:rPr>
+        <w:t xml:space="preserve">  Mayıs 2026</w:t>
       </w:r>
     </w:p>
     <w:p>
@@ -124,7 +186,51 @@
           <w:sz w:val="20"/>
           <w:szCs w:val="20"/>
         </w:rPr>
-        <w:t>Ana ilke: Hedef kullanıcı Figma veya InDesign açmamış. Uygulamayı hayatında ilk kez açan biri kafası karışmadan 10 dakika içinde ilk tasarımını tamamlayabilmeli.</w:t>
+        <w:t xml:space="preserve">Ana ilke: Hedef kullanıcı </w:t>
+      </w:r>
+      <w:proofErr w:type="spellStart"/>
+      <w:r>
+        <w:rPr>
+          <w:i/>
+          <w:iCs/>
+          <w:color w:val="0F172A"/>
+          <w:sz w:val="20"/>
+          <w:szCs w:val="20"/>
+        </w:rPr>
+        <w:t>Figma</w:t>
+      </w:r>
+      <w:proofErr w:type="spellEnd"/>
+      <w:r>
+        <w:rPr>
+          <w:i/>
+          <w:iCs/>
+          <w:color w:val="0F172A"/>
+          <w:sz w:val="20"/>
+          <w:szCs w:val="20"/>
+        </w:rPr>
+        <w:t xml:space="preserve"> veya </w:t>
+      </w:r>
+      <w:proofErr w:type="spellStart"/>
+      <w:r>
+        <w:rPr>
+          <w:i/>
+          <w:iCs/>
+          <w:color w:val="0F172A"/>
+          <w:sz w:val="20"/>
+          <w:szCs w:val="20"/>
+        </w:rPr>
+        <w:t>InDesign</w:t>
+      </w:r>
+      <w:proofErr w:type="spellEnd"/>
+      <w:r>
+        <w:rPr>
+          <w:i/>
+          <w:iCs/>
+          <w:color w:val="0F172A"/>
+          <w:sz w:val="20"/>
+          <w:szCs w:val="20"/>
+        </w:rPr>
+        <w:t xml:space="preserve"> açmamış. Uygulamayı hayatında ilk kez açan biri kafası karışmadan 10 dakika içinde ilk tasarımını tamamlayabilmeli.</w:t>
       </w:r>
     </w:p>
     <w:p>
@@ -136,8 +242,13 @@
       <w:pPr>
         <w:pStyle w:val="Balk3"/>
       </w:pPr>
-      <w:r>
-        <w:t>1.1  İki katmanlı deneyim</w:t>
+      <w:proofErr w:type="gramStart"/>
+      <w:r>
+        <w:t>1.1  İki</w:t>
+      </w:r>
+      <w:proofErr w:type="gramEnd"/>
+      <w:r>
+        <w:t xml:space="preserve"> katmanlı deneyim</w:t>
       </w:r>
     </w:p>
     <w:p>
@@ -172,7 +283,21 @@
         <w:rPr>
           <w:color w:val="475569"/>
         </w:rPr>
-        <w:t>Kanvas üzerindeki hızlı erişim toolbar'ı. Seçime göre değişen bağlamsal araçlar. En çok kullanılan 5-6 ayar, büyük ikonlar, kısa etiketler.</w:t>
+        <w:t xml:space="preserve">Kanvas üzerindeki hızlı erişim </w:t>
+      </w:r>
+      <w:proofErr w:type="spellStart"/>
+      <w:r>
+        <w:rPr>
+          <w:color w:val="475569"/>
+        </w:rPr>
+        <w:t>toolbar'ı</w:t>
+      </w:r>
+      <w:proofErr w:type="spellEnd"/>
+      <w:r>
+        <w:rPr>
+          <w:color w:val="475569"/>
+        </w:rPr>
+        <w:t>. Seçime göre değişen bağlamsal araçlar. En çok kullanılan 5-6 ayar, büyük ikonlar, kısa etiketler.</w:t>
       </w:r>
     </w:p>
     <w:p>
@@ -196,7 +321,21 @@
         <w:rPr>
           <w:color w:val="475569"/>
         </w:rPr>
-        <w:t>Sağ panel. Akordiyonlu yapı. Tüm gelişmiş ayarlar burada. Acemi kullanıcı bu paneli açmayabilir.</w:t>
+        <w:t xml:space="preserve">Sağ panel. </w:t>
+      </w:r>
+      <w:proofErr w:type="spellStart"/>
+      <w:r>
+        <w:rPr>
+          <w:color w:val="475569"/>
+        </w:rPr>
+        <w:t>Akordiyonlu</w:t>
+      </w:r>
+      <w:proofErr w:type="spellEnd"/>
+      <w:r>
+        <w:rPr>
+          <w:color w:val="475569"/>
+        </w:rPr>
+        <w:t xml:space="preserve"> yapı. Tüm gelişmiş ayarlar burada. Acemi kullanıcı bu paneli açmayabilir.</w:t>
       </w:r>
     </w:p>
     <w:p>
@@ -208,8 +347,13 @@
       <w:pPr>
         <w:pStyle w:val="Balk3"/>
       </w:pPr>
-      <w:r>
-        <w:t>1.2  Referans ürünler</w:t>
+      <w:proofErr w:type="gramStart"/>
+      <w:r>
+        <w:t>1.2  Referans</w:t>
+      </w:r>
+      <w:proofErr w:type="gramEnd"/>
+      <w:r>
+        <w:t xml:space="preserve"> ürünler</w:t>
       </w:r>
     </w:p>
     <w:p>
@@ -232,19 +376,43 @@
         </w:numPr>
         <w:spacing w:before="40" w:after="40"/>
       </w:pPr>
+      <w:proofErr w:type="spellStart"/>
       <w:r>
         <w:rPr>
           <w:b/>
           <w:bCs/>
           <w:color w:val="0F172A"/>
         </w:rPr>
-        <w:t xml:space="preserve">Vistaprint stüdyo — </w:t>
-      </w:r>
-      <w:r>
-        <w:rPr>
-          <w:color w:val="475569"/>
-        </w:rPr>
-        <w:t>Baskı ürünü + acemi kullanıcı kombinasyonu. Toolbar yapısı ve ikon boyutları incelenebilir. Ancak gereğinden fazla basite indirgenmiş — biz daha fazla kontrol sunacağız.</w:t>
+        <w:t>Vistaprint</w:t>
+      </w:r>
+      <w:proofErr w:type="spellEnd"/>
+      <w:r>
+        <w:rPr>
+          <w:b/>
+          <w:bCs/>
+          <w:color w:val="0F172A"/>
+        </w:rPr>
+        <w:t xml:space="preserve"> stüdyo — </w:t>
+      </w:r>
+      <w:r>
+        <w:rPr>
+          <w:color w:val="475569"/>
+        </w:rPr>
+        <w:t xml:space="preserve">Baskı ürünü + acemi kullanıcı kombinasyonu. </w:t>
+      </w:r>
+      <w:proofErr w:type="spellStart"/>
+      <w:r>
+        <w:rPr>
+          <w:color w:val="475569"/>
+        </w:rPr>
+        <w:t>Toolbar</w:t>
+      </w:r>
+      <w:proofErr w:type="spellEnd"/>
+      <w:r>
+        <w:rPr>
+          <w:color w:val="475569"/>
+        </w:rPr>
+        <w:t xml:space="preserve"> yapısı ve ikon boyutları incelenebilir. Ancak gereğinden fazla basite indirgenmiş — biz daha fazla kontrol sunacağız.</w:t>
       </w:r>
     </w:p>
     <w:p>
@@ -256,13 +424,23 @@
         </w:numPr>
         <w:spacing w:before="40" w:after="40"/>
       </w:pPr>
+      <w:proofErr w:type="spellStart"/>
       <w:r>
         <w:rPr>
           <w:b/>
           <w:bCs/>
           <w:color w:val="0F172A"/>
         </w:rPr>
-        <w:t xml:space="preserve">Shopify ürün yönetimi — </w:t>
+        <w:t>Shopify</w:t>
+      </w:r>
+      <w:proofErr w:type="spellEnd"/>
+      <w:r>
+        <w:rPr>
+          <w:b/>
+          <w:bCs/>
+          <w:color w:val="0F172A"/>
+        </w:rPr>
+        <w:t xml:space="preserve"> ürün yönetimi — </w:t>
       </w:r>
       <w:r>
         <w:rPr>
@@ -280,13 +458,41 @@
         </w:numPr>
         <w:spacing w:before="40" w:after="40"/>
       </w:pPr>
+      <w:proofErr w:type="spellStart"/>
       <w:r>
         <w:rPr>
           <w:b/>
           <w:bCs/>
           <w:color w:val="0F172A"/>
         </w:rPr>
-        <w:t xml:space="preserve">Canva toolbar — </w:t>
+        <w:t>Canva</w:t>
+      </w:r>
+      <w:proofErr w:type="spellEnd"/>
+      <w:r>
+        <w:rPr>
+          <w:b/>
+          <w:bCs/>
+          <w:color w:val="0F172A"/>
+        </w:rPr>
+        <w:t xml:space="preserve"> </w:t>
+      </w:r>
+      <w:proofErr w:type="spellStart"/>
+      <w:r>
+        <w:rPr>
+          <w:b/>
+          <w:bCs/>
+          <w:color w:val="0F172A"/>
+        </w:rPr>
+        <w:t>toolbar</w:t>
+      </w:r>
+      <w:proofErr w:type="spellEnd"/>
+      <w:r>
+        <w:rPr>
+          <w:b/>
+          <w:bCs/>
+          <w:color w:val="0F172A"/>
+        </w:rPr>
+        <w:t xml:space="preserve"> — </w:t>
       </w:r>
       <w:r>
         <w:rPr>
@@ -304,13 +510,41 @@
         </w:numPr>
         <w:spacing w:before="40" w:after="40"/>
       </w:pPr>
+      <w:proofErr w:type="spellStart"/>
       <w:r>
         <w:rPr>
           <w:b/>
           <w:bCs/>
           <w:color w:val="0F172A"/>
         </w:rPr>
-        <w:t xml:space="preserve">Figma / InDesign — </w:t>
+        <w:t>Figma</w:t>
+      </w:r>
+      <w:proofErr w:type="spellEnd"/>
+      <w:r>
+        <w:rPr>
+          <w:b/>
+          <w:bCs/>
+          <w:color w:val="0F172A"/>
+        </w:rPr>
+        <w:t xml:space="preserve"> / </w:t>
+      </w:r>
+      <w:proofErr w:type="spellStart"/>
+      <w:r>
+        <w:rPr>
+          <w:b/>
+          <w:bCs/>
+          <w:color w:val="0F172A"/>
+        </w:rPr>
+        <w:t>InDesign</w:t>
+      </w:r>
+      <w:proofErr w:type="spellEnd"/>
+      <w:r>
+        <w:rPr>
+          <w:b/>
+          <w:bCs/>
+          <w:color w:val="0F172A"/>
+        </w:rPr>
+        <w:t xml:space="preserve"> — </w:t>
       </w:r>
       <w:r>
         <w:rPr>
@@ -387,8 +621,13 @@
       <w:pPr>
         <w:pStyle w:val="Balk3"/>
       </w:pPr>
-      <w:r>
-        <w:t>2.1  Ana renkler</w:t>
+      <w:proofErr w:type="gramStart"/>
+      <w:r>
+        <w:t>2.1  Ana</w:t>
+      </w:r>
+      <w:proofErr w:type="gramEnd"/>
+      <w:r>
+        <w:t xml:space="preserve"> renkler</w:t>
       </w:r>
     </w:p>
     <w:p>
@@ -490,6 +729,7 @@
             </w:tcMar>
           </w:tcPr>
           <w:p>
+            <w:proofErr w:type="spellStart"/>
             <w:r>
               <w:rPr>
                 <w:b/>
@@ -498,7 +738,18 @@
                 <w:sz w:val="20"/>
                 <w:szCs w:val="20"/>
               </w:rPr>
-              <w:t>Hex kodu</w:t>
+              <w:t>Hex</w:t>
+            </w:r>
+            <w:proofErr w:type="spellEnd"/>
+            <w:r>
+              <w:rPr>
+                <w:b/>
+                <w:bCs/>
+                <w:color w:val="FFFFFF"/>
+                <w:sz w:val="20"/>
+                <w:szCs w:val="20"/>
+              </w:rPr>
+              <w:t xml:space="preserve"> kodu</w:t>
             </w:r>
           </w:p>
         </w:tc>
@@ -634,7 +885,25 @@
                 <w:sz w:val="20"/>
                 <w:szCs w:val="20"/>
               </w:rPr>
-              <w:t>Birincil CTA butonu, aktif sekme, focus ring — SADECE bu üç yerde</w:t>
+              <w:t xml:space="preserve">Birincil CTA butonu, aktif sekme, </w:t>
+            </w:r>
+            <w:proofErr w:type="spellStart"/>
+            <w:r>
+              <w:rPr>
+                <w:color w:val="475569"/>
+                <w:sz w:val="20"/>
+                <w:szCs w:val="20"/>
+              </w:rPr>
+              <w:t>focus</w:t>
+            </w:r>
+            <w:proofErr w:type="spellEnd"/>
+            <w:r>
+              <w:rPr>
+                <w:color w:val="475569"/>
+                <w:sz w:val="20"/>
+                <w:szCs w:val="20"/>
+              </w:rPr>
+              <w:t xml:space="preserve"> ring — SADECE bu üç yerde</w:t>
             </w:r>
           </w:p>
         </w:tc>
@@ -740,7 +1009,25 @@
                 <w:sz w:val="20"/>
                 <w:szCs w:val="20"/>
               </w:rPr>
-              <w:t>Başlıklar, birincil metin, aktif durum (text-primary)</w:t>
+              <w:t>Başlıklar, birincil metin, aktif durum (</w:t>
+            </w:r>
+            <w:proofErr w:type="spellStart"/>
+            <w:r>
+              <w:rPr>
+                <w:color w:val="475569"/>
+                <w:sz w:val="20"/>
+                <w:szCs w:val="20"/>
+              </w:rPr>
+              <w:t>text-primary</w:t>
+            </w:r>
+            <w:proofErr w:type="spellEnd"/>
+            <w:r>
+              <w:rPr>
+                <w:color w:val="475569"/>
+                <w:sz w:val="20"/>
+                <w:szCs w:val="20"/>
+              </w:rPr>
+              <w:t>)</w:t>
             </w:r>
           </w:p>
         </w:tc>
@@ -840,13 +1127,41 @@
             </w:tcMar>
           </w:tcPr>
           <w:p>
+            <w:proofErr w:type="spellStart"/>
             <w:r>
               <w:rPr>
                 <w:color w:val="475569"/>
                 <w:sz w:val="20"/>
                 <w:szCs w:val="20"/>
               </w:rPr>
-              <w:t>Hover, akordiyon başlığı, alternatif satır (surface-subtle)</w:t>
+              <w:t>Hover</w:t>
+            </w:r>
+            <w:proofErr w:type="spellEnd"/>
+            <w:r>
+              <w:rPr>
+                <w:color w:val="475569"/>
+                <w:sz w:val="20"/>
+                <w:szCs w:val="20"/>
+              </w:rPr>
+              <w:t>, akordiyon başlığı, alternatif satır (</w:t>
+            </w:r>
+            <w:proofErr w:type="spellStart"/>
+            <w:r>
+              <w:rPr>
+                <w:color w:val="475569"/>
+                <w:sz w:val="20"/>
+                <w:szCs w:val="20"/>
+              </w:rPr>
+              <w:t>surface-subtle</w:t>
+            </w:r>
+            <w:proofErr w:type="spellEnd"/>
+            <w:r>
+              <w:rPr>
+                <w:color w:val="475569"/>
+                <w:sz w:val="20"/>
+                <w:szCs w:val="20"/>
+              </w:rPr>
+              <w:t>)</w:t>
             </w:r>
           </w:p>
         </w:tc>
@@ -952,7 +1267,25 @@
                 <w:sz w:val="20"/>
                 <w:szCs w:val="20"/>
               </w:rPr>
-              <w:t>İkincil metin, pasif ikon, açıklama metinleri (text-secondary)</w:t>
+              <w:t>İkincil metin, pasif ikon, açıklama metinleri (</w:t>
+            </w:r>
+            <w:proofErr w:type="spellStart"/>
+            <w:r>
+              <w:rPr>
+                <w:color w:val="475569"/>
+                <w:sz w:val="20"/>
+                <w:szCs w:val="20"/>
+              </w:rPr>
+              <w:t>text-secondary</w:t>
+            </w:r>
+            <w:proofErr w:type="spellEnd"/>
+            <w:r>
+              <w:rPr>
+                <w:color w:val="475569"/>
+                <w:sz w:val="20"/>
+                <w:szCs w:val="20"/>
+              </w:rPr>
+              <w:t>)</w:t>
             </w:r>
           </w:p>
         </w:tc>
@@ -1058,7 +1391,43 @@
                 <w:sz w:val="20"/>
                 <w:szCs w:val="20"/>
               </w:rPr>
-              <w:t>Standart kenarlık, kart, input, ayraç (border-default)</w:t>
+              <w:t xml:space="preserve">Standart kenarlık, kart, </w:t>
+            </w:r>
+            <w:proofErr w:type="spellStart"/>
+            <w:r>
+              <w:rPr>
+                <w:color w:val="475569"/>
+                <w:sz w:val="20"/>
+                <w:szCs w:val="20"/>
+              </w:rPr>
+              <w:t>input</w:t>
+            </w:r>
+            <w:proofErr w:type="spellEnd"/>
+            <w:r>
+              <w:rPr>
+                <w:color w:val="475569"/>
+                <w:sz w:val="20"/>
+                <w:szCs w:val="20"/>
+              </w:rPr>
+              <w:t>, ayraç (</w:t>
+            </w:r>
+            <w:proofErr w:type="spellStart"/>
+            <w:r>
+              <w:rPr>
+                <w:color w:val="475569"/>
+                <w:sz w:val="20"/>
+                <w:szCs w:val="20"/>
+              </w:rPr>
+              <w:t>border-default</w:t>
+            </w:r>
+            <w:proofErr w:type="spellEnd"/>
+            <w:r>
+              <w:rPr>
+                <w:color w:val="475569"/>
+                <w:sz w:val="20"/>
+                <w:szCs w:val="20"/>
+              </w:rPr>
+              <w:t>)</w:t>
             </w:r>
           </w:p>
         </w:tc>
@@ -1179,8 +1548,13 @@
       <w:pPr>
         <w:pStyle w:val="Balk3"/>
       </w:pPr>
-      <w:r>
-        <w:t>2.2  Anlamsal renkler — sadece belirli durumlarda</w:t>
+      <w:proofErr w:type="gramStart"/>
+      <w:r>
+        <w:t>2.2  Anlamsal</w:t>
+      </w:r>
+      <w:proofErr w:type="gramEnd"/>
+      <w:r>
+        <w:t xml:space="preserve"> renkler — sadece belirli durumlarda</w:t>
       </w:r>
     </w:p>
     <w:p>
@@ -1282,6 +1656,7 @@
             </w:tcMar>
           </w:tcPr>
           <w:p>
+            <w:proofErr w:type="spellStart"/>
             <w:r>
               <w:rPr>
                 <w:b/>
@@ -1290,7 +1665,18 @@
                 <w:sz w:val="20"/>
                 <w:szCs w:val="20"/>
               </w:rPr>
-              <w:t>Hex kodu</w:t>
+              <w:t>Hex</w:t>
+            </w:r>
+            <w:proofErr w:type="spellEnd"/>
+            <w:r>
+              <w:rPr>
+                <w:b/>
+                <w:bCs/>
+                <w:color w:val="FFFFFF"/>
+                <w:sz w:val="20"/>
+                <w:szCs w:val="20"/>
+              </w:rPr>
+              <w:t xml:space="preserve"> kodu</w:t>
             </w:r>
           </w:p>
         </w:tc>
@@ -1653,8 +2039,13 @@
       <w:pPr>
         <w:pStyle w:val="Balk3"/>
       </w:pPr>
-      <w:r>
-        <w:t>2.3  Renk kullanım kuralları</w:t>
+      <w:proofErr w:type="gramStart"/>
+      <w:r>
+        <w:t>2.3  Renk</w:t>
+      </w:r>
+      <w:proofErr w:type="gramEnd"/>
+      <w:r>
+        <w:t xml:space="preserve"> kullanım kuralları</w:t>
       </w:r>
     </w:p>
     <w:p>
@@ -1820,8 +2211,13 @@
       <w:pPr>
         <w:pStyle w:val="Balk3"/>
       </w:pPr>
-      <w:r>
-        <w:t>3.1  Font ailesi</w:t>
+      <w:proofErr w:type="gramStart"/>
+      <w:r>
+        <w:t>3.1  Font</w:t>
+      </w:r>
+      <w:proofErr w:type="gramEnd"/>
+      <w:r>
+        <w:t xml:space="preserve"> ailesi</w:t>
       </w:r>
     </w:p>
     <w:p>
@@ -1845,7 +2241,21 @@
         <w:rPr>
           <w:color w:val="475569"/>
         </w:rPr>
-        <w:t>Inter veya sistem sans-serif. Ekranda yüksek okunabilirlik için optimize.</w:t>
+        <w:t xml:space="preserve">Inter veya sistem </w:t>
+      </w:r>
+      <w:proofErr w:type="spellStart"/>
+      <w:r>
+        <w:rPr>
+          <w:color w:val="475569"/>
+        </w:rPr>
+        <w:t>sans-serif</w:t>
+      </w:r>
+      <w:proofErr w:type="spellEnd"/>
+      <w:r>
+        <w:rPr>
+          <w:color w:val="475569"/>
+        </w:rPr>
+        <w:t>. Ekranda yüksek okunabilirlik için optimize.</w:t>
       </w:r>
     </w:p>
     <w:p>
@@ -1865,11 +2275,47 @@
         </w:rPr>
         <w:t xml:space="preserve">Mono font — </w:t>
       </w:r>
-      <w:r>
-        <w:rPr>
-          <w:color w:val="475569"/>
-        </w:rPr>
-        <w:t>Hex kodları, teknik değerler gibi kod içeriği için. Courier New veya JetBrains Mono.</w:t>
+      <w:proofErr w:type="spellStart"/>
+      <w:r>
+        <w:rPr>
+          <w:color w:val="475569"/>
+        </w:rPr>
+        <w:t>Hex</w:t>
+      </w:r>
+      <w:proofErr w:type="spellEnd"/>
+      <w:r>
+        <w:rPr>
+          <w:color w:val="475569"/>
+        </w:rPr>
+        <w:t xml:space="preserve"> kodları, teknik değerler gibi kod içeriği için. </w:t>
+      </w:r>
+      <w:proofErr w:type="spellStart"/>
+      <w:r>
+        <w:rPr>
+          <w:color w:val="475569"/>
+        </w:rPr>
+        <w:t>Courier</w:t>
+      </w:r>
+      <w:proofErr w:type="spellEnd"/>
+      <w:r>
+        <w:rPr>
+          <w:color w:val="475569"/>
+        </w:rPr>
+        <w:t xml:space="preserve"> New veya </w:t>
+      </w:r>
+      <w:proofErr w:type="spellStart"/>
+      <w:r>
+        <w:rPr>
+          <w:color w:val="475569"/>
+        </w:rPr>
+        <w:t>JetBrains</w:t>
+      </w:r>
+      <w:proofErr w:type="spellEnd"/>
+      <w:r>
+        <w:rPr>
+          <w:color w:val="475569"/>
+        </w:rPr>
+        <w:t xml:space="preserve"> Mono.</w:t>
       </w:r>
     </w:p>
     <w:p>
@@ -1901,8 +2347,13 @@
       <w:pPr>
         <w:pStyle w:val="Balk3"/>
       </w:pPr>
-      <w:r>
-        <w:t>3.2  Boyut skalası</w:t>
+      <w:proofErr w:type="gramStart"/>
+      <w:r>
+        <w:t>3.2  Boyut</w:t>
+      </w:r>
+      <w:proofErr w:type="gramEnd"/>
+      <w:r>
+        <w:t xml:space="preserve"> skalası</w:t>
       </w:r>
     </w:p>
     <w:p>
@@ -2228,16 +2679,7 @@
                 <w:sz w:val="20"/>
                 <w:szCs w:val="20"/>
               </w:rPr>
-              <w:t>4</w:t>
-            </w:r>
-            <w:r>
-              <w:rPr>
-                <w:rFonts w:ascii="Courier New" w:eastAsia="Courier New" w:hAnsi="Courier New" w:cs="Courier New"/>
-                <w:color w:val="475569"/>
-                <w:sz w:val="20"/>
-                <w:szCs w:val="20"/>
-              </w:rPr>
-              <w:t>00</w:t>
+              <w:t>400</w:t>
             </w:r>
           </w:p>
         </w:tc>
@@ -2494,7 +2936,25 @@
                 <w:sz w:val="20"/>
                 <w:szCs w:val="20"/>
               </w:rPr>
-              <w:t>Sekme alt etiketi, tooltip metni, yardım notu</w:t>
+              <w:t xml:space="preserve">Sekme alt etiketi, </w:t>
+            </w:r>
+            <w:proofErr w:type="spellStart"/>
+            <w:r>
+              <w:rPr>
+                <w:color w:val="475569"/>
+                <w:sz w:val="20"/>
+                <w:szCs w:val="20"/>
+              </w:rPr>
+              <w:t>tooltip</w:t>
+            </w:r>
+            <w:proofErr w:type="spellEnd"/>
+            <w:r>
+              <w:rPr>
+                <w:color w:val="475569"/>
+                <w:sz w:val="20"/>
+                <w:szCs w:val="20"/>
+              </w:rPr>
+              <w:t xml:space="preserve"> metni, yardım notu</w:t>
             </w:r>
           </w:p>
         </w:tc>
@@ -2547,7 +3007,51 @@
           <w:sz w:val="20"/>
           <w:szCs w:val="20"/>
         </w:rPr>
-        <w:t>Tüm başlıklar sentence case: 'Hücre görünümü' — ASLA 'HÜCRE GÖRÜNÜMÜ' değil. Büyük harf tarama hızını düşürür.</w:t>
+        <w:t xml:space="preserve">Tüm başlıklar </w:t>
+      </w:r>
+      <w:proofErr w:type="spellStart"/>
+      <w:r>
+        <w:rPr>
+          <w:i/>
+          <w:iCs/>
+          <w:color w:val="0F172A"/>
+          <w:sz w:val="20"/>
+          <w:szCs w:val="20"/>
+        </w:rPr>
+        <w:t>sentence</w:t>
+      </w:r>
+      <w:proofErr w:type="spellEnd"/>
+      <w:r>
+        <w:rPr>
+          <w:i/>
+          <w:iCs/>
+          <w:color w:val="0F172A"/>
+          <w:sz w:val="20"/>
+          <w:szCs w:val="20"/>
+        </w:rPr>
+        <w:t xml:space="preserve"> </w:t>
+      </w:r>
+      <w:proofErr w:type="spellStart"/>
+      <w:r>
+        <w:rPr>
+          <w:i/>
+          <w:iCs/>
+          <w:color w:val="0F172A"/>
+          <w:sz w:val="20"/>
+          <w:szCs w:val="20"/>
+        </w:rPr>
+        <w:t>case</w:t>
+      </w:r>
+      <w:proofErr w:type="spellEnd"/>
+      <w:r>
+        <w:rPr>
+          <w:i/>
+          <w:iCs/>
+          <w:color w:val="0F172A"/>
+          <w:sz w:val="20"/>
+          <w:szCs w:val="20"/>
+        </w:rPr>
+        <w:t>: 'Hücre görünümü' — ASLA 'HÜCRE GÖRÜNÜMÜ' değil. Büyük harf tarama hızını düşürür.</w:t>
       </w:r>
     </w:p>
     <w:p>
@@ -2568,8 +3072,13 @@
       <w:pPr>
         <w:pStyle w:val="Balk3"/>
       </w:pPr>
-      <w:r>
-        <w:t>4.1  İkon seti</w:t>
+      <w:proofErr w:type="gramStart"/>
+      <w:r>
+        <w:t>4.1  İkon</w:t>
+      </w:r>
+      <w:proofErr w:type="gramEnd"/>
+      <w:r>
+        <w:t xml:space="preserve"> seti</w:t>
       </w:r>
     </w:p>
     <w:p>
@@ -2580,7 +3089,35 @@
         <w:rPr>
           <w:color w:val="0F172A"/>
         </w:rPr>
-        <w:t>Proje boyunca yalnızca Lucide React kullanılır. Başka ikon seti karıştırılmaz.</w:t>
+        <w:t xml:space="preserve">Proje boyunca yalnızca </w:t>
+      </w:r>
+      <w:proofErr w:type="spellStart"/>
+      <w:r>
+        <w:rPr>
+          <w:color w:val="0F172A"/>
+        </w:rPr>
+        <w:t>Lucide</w:t>
+      </w:r>
+      <w:proofErr w:type="spellEnd"/>
+      <w:r>
+        <w:rPr>
+          <w:color w:val="0F172A"/>
+        </w:rPr>
+        <w:t xml:space="preserve"> </w:t>
+      </w:r>
+      <w:proofErr w:type="spellStart"/>
+      <w:r>
+        <w:rPr>
+          <w:color w:val="0F172A"/>
+        </w:rPr>
+        <w:t>React</w:t>
+      </w:r>
+      <w:proofErr w:type="spellEnd"/>
+      <w:r>
+        <w:rPr>
+          <w:color w:val="0F172A"/>
+        </w:rPr>
+        <w:t xml:space="preserve"> kullanılır. Başka ikon seti karıştırılmaz.</w:t>
       </w:r>
     </w:p>
     <w:p>
@@ -2596,7 +3133,21 @@
         <w:rPr>
           <w:color w:val="0F172A"/>
         </w:rPr>
-        <w:t>Tüm ikonlar outline stilinde</w:t>
+        <w:t xml:space="preserve">Tüm ikonlar </w:t>
+      </w:r>
+      <w:proofErr w:type="spellStart"/>
+      <w:r>
+        <w:rPr>
+          <w:color w:val="0F172A"/>
+        </w:rPr>
+        <w:t>outline</w:t>
+      </w:r>
+      <w:proofErr w:type="spellEnd"/>
+      <w:r>
+        <w:rPr>
+          <w:color w:val="0F172A"/>
+        </w:rPr>
+        <w:t xml:space="preserve"> stilinde</w:t>
       </w:r>
     </w:p>
     <w:p>
@@ -2608,11 +3159,19 @@
         </w:numPr>
         <w:spacing w:before="40" w:after="40"/>
       </w:pPr>
-      <w:r>
-        <w:rPr>
-          <w:color w:val="0F172A"/>
-        </w:rPr>
-        <w:t>Filled varyantlar kullanılmaz</w:t>
+      <w:proofErr w:type="spellStart"/>
+      <w:r>
+        <w:rPr>
+          <w:color w:val="0F172A"/>
+        </w:rPr>
+        <w:t>Filled</w:t>
+      </w:r>
+      <w:proofErr w:type="spellEnd"/>
+      <w:r>
+        <w:rPr>
+          <w:color w:val="0F172A"/>
+        </w:rPr>
+        <w:t xml:space="preserve"> varyantlar kullanılmaz</w:t>
       </w:r>
     </w:p>
     <w:p>
@@ -2640,8 +3199,13 @@
       <w:pPr>
         <w:pStyle w:val="Balk3"/>
       </w:pPr>
-      <w:r>
-        <w:t>4.2  Boyut kuralları — bağlama göre 4 boyut</w:t>
+      <w:proofErr w:type="gramStart"/>
+      <w:r>
+        <w:t>4.2  Boyut</w:t>
+      </w:r>
+      <w:proofErr w:type="gramEnd"/>
+      <w:r>
+        <w:t xml:space="preserve"> kuralları — bağlama göre 4 boyut</w:t>
       </w:r>
     </w:p>
     <w:p>
@@ -2754,6 +3318,7 @@
             </w:tcMar>
           </w:tcPr>
           <w:p>
+            <w:proofErr w:type="spellStart"/>
             <w:r>
               <w:rPr>
                 <w:b/>
@@ -2762,7 +3327,18 @@
                 <w:sz w:val="20"/>
                 <w:szCs w:val="20"/>
               </w:rPr>
-              <w:t>Lucide prop</w:t>
+              <w:t>Lucide</w:t>
+            </w:r>
+            <w:proofErr w:type="spellEnd"/>
+            <w:r>
+              <w:rPr>
+                <w:b/>
+                <w:bCs/>
+                <w:color w:val="FFFFFF"/>
+                <w:sz w:val="20"/>
+                <w:szCs w:val="20"/>
+              </w:rPr>
+              <w:t xml:space="preserve"> prop</w:t>
             </w:r>
           </w:p>
         </w:tc>
@@ -2827,118 +3403,9 @@
                 <w:sz w:val="24"/>
                 <w:szCs w:val="24"/>
               </w:rPr>
-              <w:t>32 px</w:t>
-            </w:r>
-          </w:p>
-        </w:tc>
-        <w:tc>
-          <w:tcPr>
-            <w:tcW w:w="2891" w:type="dxa"/>
-            <w:tcBorders>
-              <w:top w:val="single" w:sz="4" w:space="0" w:color="E2E8F0"/>
-              <w:left w:val="single" w:sz="4" w:space="0" w:color="E2E8F0"/>
-              <w:bottom w:val="single" w:sz="4" w:space="0" w:color="E2E8F0"/>
-              <w:right w:val="single" w:sz="4" w:space="0" w:color="E2E8F0"/>
-            </w:tcBorders>
-            <w:tcMar>
-              <w:top w:w="80" w:type="dxa"/>
-              <w:left w:w="120" w:type="dxa"/>
-              <w:bottom w:w="80" w:type="dxa"/>
-              <w:right w:w="120" w:type="dxa"/>
-            </w:tcMar>
-          </w:tcPr>
-          <w:p>
-            <w:r>
-              <w:rPr>
-                <w:b/>
-                <w:bCs/>
-                <w:color w:val="0F172A"/>
-                <w:sz w:val="20"/>
-                <w:szCs w:val="20"/>
-              </w:rPr>
-              <w:t>Üst sekme menüsü</w:t>
-            </w:r>
-          </w:p>
-        </w:tc>
-        <w:tc>
-          <w:tcPr>
-            <w:tcW w:w="1927" w:type="dxa"/>
-            <w:tcBorders>
-              <w:top w:val="single" w:sz="4" w:space="0" w:color="E2E8F0"/>
-              <w:left w:val="single" w:sz="4" w:space="0" w:color="E2E8F0"/>
-              <w:bottom w:val="single" w:sz="4" w:space="0" w:color="E2E8F0"/>
-              <w:right w:val="single" w:sz="4" w:space="0" w:color="E2E8F0"/>
-            </w:tcBorders>
-            <w:shd w:val="clear" w:color="auto" w:fill="F3F4F6"/>
-            <w:tcMar>
-              <w:top w:w="80" w:type="dxa"/>
-              <w:left w:w="120" w:type="dxa"/>
-              <w:bottom w:w="80" w:type="dxa"/>
-              <w:right w:w="120" w:type="dxa"/>
-            </w:tcMar>
-          </w:tcPr>
-          <w:p>
-            <w:r>
-              <w:rPr>
-                <w:rFonts w:ascii="Courier New" w:eastAsia="Courier New" w:hAnsi="Courier New" w:cs="Courier New"/>
-                <w:color w:val="475569"/>
-                <w:sz w:val="18"/>
-                <w:szCs w:val="18"/>
-              </w:rPr>
-              <w:t>size={32}</w:t>
-            </w:r>
-          </w:p>
-        </w:tc>
-        <w:tc>
-          <w:tcPr>
-            <w:tcW w:w="3373" w:type="dxa"/>
-            <w:tcBorders>
-              <w:top w:val="single" w:sz="4" w:space="0" w:color="E2E8F0"/>
-              <w:left w:val="single" w:sz="4" w:space="0" w:color="E2E8F0"/>
-              <w:bottom w:val="single" w:sz="4" w:space="0" w:color="E2E8F0"/>
-              <w:right w:val="single" w:sz="4" w:space="0" w:color="E2E8F0"/>
-            </w:tcBorders>
-            <w:tcMar>
-              <w:top w:w="80" w:type="dxa"/>
-              <w:left w:w="120" w:type="dxa"/>
-              <w:bottom w:w="80" w:type="dxa"/>
-              <w:right w:w="120" w:type="dxa"/>
-            </w:tcMar>
-          </w:tcPr>
-          <w:p>
-            <w:r>
-              <w:rPr>
-                <w:color w:val="475569"/>
-                <w:sz w:val="20"/>
-                <w:szCs w:val="20"/>
-              </w:rPr>
-              <w:t>En büyük boy — 4 sekme ikonu burada</w:t>
-            </w:r>
-          </w:p>
-        </w:tc>
-      </w:tr>
-      <w:tr>
-        <w:tc>
-          <w:tcPr>
-            <w:tcW w:w="1445" w:type="dxa"/>
-            <w:tcBorders>
-              <w:top w:val="single" w:sz="4" w:space="0" w:color="E2E8F0"/>
-              <w:left w:val="single" w:sz="4" w:space="0" w:color="E2E8F0"/>
-              <w:bottom w:val="single" w:sz="4" w:space="0" w:color="E2E8F0"/>
-              <w:right w:val="single" w:sz="4" w:space="0" w:color="E2E8F0"/>
-            </w:tcBorders>
-            <w:shd w:val="clear" w:color="auto" w:fill="FFFFFF"/>
-            <w:tcMar>
-              <w:top w:w="80" w:type="dxa"/>
-              <w:left w:w="120" w:type="dxa"/>
-              <w:bottom w:w="80" w:type="dxa"/>
-              <w:right w:w="120" w:type="dxa"/>
-            </w:tcMar>
-          </w:tcPr>
-          <w:p>
-            <w:pPr>
-              <w:jc w:val="center"/>
-            </w:pPr>
+              <w:t xml:space="preserve">32 </w:t>
+            </w:r>
+            <w:proofErr w:type="spellStart"/>
             <w:r>
               <w:rPr>
                 <w:b/>
@@ -2947,8 +3414,9 @@
                 <w:sz w:val="24"/>
                 <w:szCs w:val="24"/>
               </w:rPr>
-              <w:t>24 px</w:t>
-            </w:r>
+              <w:t>px</w:t>
+            </w:r>
+            <w:proofErr w:type="spellEnd"/>
           </w:p>
         </w:tc>
         <w:tc>
@@ -2976,7 +3444,7 @@
                 <w:sz w:val="20"/>
                 <w:szCs w:val="20"/>
               </w:rPr>
-              <w:t>Hızlı erişim toolbar</w:t>
+              <w:t>Üst sekme menüsü</w:t>
             </w:r>
           </w:p>
         </w:tc>
@@ -2998,6 +3466,7 @@
             </w:tcMar>
           </w:tcPr>
           <w:p>
+            <w:proofErr w:type="gramStart"/>
             <w:r>
               <w:rPr>
                 <w:rFonts w:ascii="Courier New" w:eastAsia="Courier New" w:hAnsi="Courier New" w:cs="Courier New"/>
@@ -3005,7 +3474,17 @@
                 <w:sz w:val="18"/>
                 <w:szCs w:val="18"/>
               </w:rPr>
-              <w:t>size={24}</w:t>
+              <w:t>size={</w:t>
+            </w:r>
+            <w:proofErr w:type="gramEnd"/>
+            <w:r>
+              <w:rPr>
+                <w:rFonts w:ascii="Courier New" w:eastAsia="Courier New" w:hAnsi="Courier New" w:cs="Courier New"/>
+                <w:color w:val="475569"/>
+                <w:sz w:val="18"/>
+                <w:szCs w:val="18"/>
+              </w:rPr>
+              <w:t>32}</w:t>
             </w:r>
           </w:p>
         </w:tc>
@@ -3032,7 +3511,7 @@
                 <w:sz w:val="20"/>
                 <w:szCs w:val="20"/>
               </w:rPr>
-              <w:t>Bağlamsal araç çubuğu ikonları</w:t>
+              <w:t>En büyük boy — 4 sekme ikonu burada</w:t>
             </w:r>
           </w:p>
         </w:tc>
@@ -3067,118 +3546,9 @@
                 <w:sz w:val="24"/>
                 <w:szCs w:val="24"/>
               </w:rPr>
-              <w:t>18 px</w:t>
-            </w:r>
-          </w:p>
-        </w:tc>
-        <w:tc>
-          <w:tcPr>
-            <w:tcW w:w="2891" w:type="dxa"/>
-            <w:tcBorders>
-              <w:top w:val="single" w:sz="4" w:space="0" w:color="E2E8F0"/>
-              <w:left w:val="single" w:sz="4" w:space="0" w:color="E2E8F0"/>
-              <w:bottom w:val="single" w:sz="4" w:space="0" w:color="E2E8F0"/>
-              <w:right w:val="single" w:sz="4" w:space="0" w:color="E2E8F0"/>
-            </w:tcBorders>
-            <w:tcMar>
-              <w:top w:w="80" w:type="dxa"/>
-              <w:left w:w="120" w:type="dxa"/>
-              <w:bottom w:w="80" w:type="dxa"/>
-              <w:right w:w="120" w:type="dxa"/>
-            </w:tcMar>
-          </w:tcPr>
-          <w:p>
-            <w:r>
-              <w:rPr>
-                <w:b/>
-                <w:bCs/>
-                <w:color w:val="0F172A"/>
-                <w:sz w:val="20"/>
-                <w:szCs w:val="20"/>
-              </w:rPr>
-              <w:t>Panel akordiyonları</w:t>
-            </w:r>
-          </w:p>
-        </w:tc>
-        <w:tc>
-          <w:tcPr>
-            <w:tcW w:w="1927" w:type="dxa"/>
-            <w:tcBorders>
-              <w:top w:val="single" w:sz="4" w:space="0" w:color="E2E8F0"/>
-              <w:left w:val="single" w:sz="4" w:space="0" w:color="E2E8F0"/>
-              <w:bottom w:val="single" w:sz="4" w:space="0" w:color="E2E8F0"/>
-              <w:right w:val="single" w:sz="4" w:space="0" w:color="E2E8F0"/>
-            </w:tcBorders>
-            <w:shd w:val="clear" w:color="auto" w:fill="F3F4F6"/>
-            <w:tcMar>
-              <w:top w:w="80" w:type="dxa"/>
-              <w:left w:w="120" w:type="dxa"/>
-              <w:bottom w:w="80" w:type="dxa"/>
-              <w:right w:w="120" w:type="dxa"/>
-            </w:tcMar>
-          </w:tcPr>
-          <w:p>
-            <w:r>
-              <w:rPr>
-                <w:rFonts w:ascii="Courier New" w:eastAsia="Courier New" w:hAnsi="Courier New" w:cs="Courier New"/>
-                <w:color w:val="475569"/>
-                <w:sz w:val="18"/>
-                <w:szCs w:val="18"/>
-              </w:rPr>
-              <w:t>size={18}</w:t>
-            </w:r>
-          </w:p>
-        </w:tc>
-        <w:tc>
-          <w:tcPr>
-            <w:tcW w:w="3373" w:type="dxa"/>
-            <w:tcBorders>
-              <w:top w:val="single" w:sz="4" w:space="0" w:color="E2E8F0"/>
-              <w:left w:val="single" w:sz="4" w:space="0" w:color="E2E8F0"/>
-              <w:bottom w:val="single" w:sz="4" w:space="0" w:color="E2E8F0"/>
-              <w:right w:val="single" w:sz="4" w:space="0" w:color="E2E8F0"/>
-            </w:tcBorders>
-            <w:tcMar>
-              <w:top w:w="80" w:type="dxa"/>
-              <w:left w:w="120" w:type="dxa"/>
-              <w:bottom w:w="80" w:type="dxa"/>
-              <w:right w:w="120" w:type="dxa"/>
-            </w:tcMar>
-          </w:tcPr>
-          <w:p>
-            <w:r>
-              <w:rPr>
-                <w:color w:val="475569"/>
-                <w:sz w:val="20"/>
-                <w:szCs w:val="20"/>
-              </w:rPr>
-              <w:t>Sağ panel bölüm başlıkları</w:t>
-            </w:r>
-          </w:p>
-        </w:tc>
-      </w:tr>
-      <w:tr>
-        <w:tc>
-          <w:tcPr>
-            <w:tcW w:w="1445" w:type="dxa"/>
-            <w:tcBorders>
-              <w:top w:val="single" w:sz="4" w:space="0" w:color="E2E8F0"/>
-              <w:left w:val="single" w:sz="4" w:space="0" w:color="E2E8F0"/>
-              <w:bottom w:val="single" w:sz="4" w:space="0" w:color="E2E8F0"/>
-              <w:right w:val="single" w:sz="4" w:space="0" w:color="E2E8F0"/>
-            </w:tcBorders>
-            <w:shd w:val="clear" w:color="auto" w:fill="FFFFFF"/>
-            <w:tcMar>
-              <w:top w:w="80" w:type="dxa"/>
-              <w:left w:w="120" w:type="dxa"/>
-              <w:bottom w:w="80" w:type="dxa"/>
-              <w:right w:w="120" w:type="dxa"/>
-            </w:tcMar>
-          </w:tcPr>
-          <w:p>
-            <w:pPr>
-              <w:jc w:val="center"/>
-            </w:pPr>
+              <w:t xml:space="preserve">24 </w:t>
+            </w:r>
+            <w:proofErr w:type="spellStart"/>
             <w:r>
               <w:rPr>
                 <w:b/>
@@ -3187,8 +3557,9 @@
                 <w:sz w:val="24"/>
                 <w:szCs w:val="24"/>
               </w:rPr>
-              <w:t>16 px</w:t>
-            </w:r>
+              <w:t>px</w:t>
+            </w:r>
+            <w:proofErr w:type="spellEnd"/>
           </w:p>
         </w:tc>
         <w:tc>
@@ -3216,8 +3587,20 @@
                 <w:sz w:val="20"/>
                 <w:szCs w:val="20"/>
               </w:rPr>
-              <w:t>Satır içi aksiyonlar</w:t>
-            </w:r>
+              <w:t xml:space="preserve">Hızlı erişim </w:t>
+            </w:r>
+            <w:proofErr w:type="spellStart"/>
+            <w:r>
+              <w:rPr>
+                <w:b/>
+                <w:bCs/>
+                <w:color w:val="0F172A"/>
+                <w:sz w:val="20"/>
+                <w:szCs w:val="20"/>
+              </w:rPr>
+              <w:t>toolbar</w:t>
+            </w:r>
+            <w:proofErr w:type="spellEnd"/>
           </w:p>
         </w:tc>
         <w:tc>
@@ -3238,6 +3621,7 @@
             </w:tcMar>
           </w:tcPr>
           <w:p>
+            <w:proofErr w:type="gramStart"/>
             <w:r>
               <w:rPr>
                 <w:rFonts w:ascii="Courier New" w:eastAsia="Courier New" w:hAnsi="Courier New" w:cs="Courier New"/>
@@ -3245,7 +3629,303 @@
                 <w:sz w:val="18"/>
                 <w:szCs w:val="18"/>
               </w:rPr>
-              <w:t>size={16}</w:t>
+              <w:t>size={</w:t>
+            </w:r>
+            <w:proofErr w:type="gramEnd"/>
+            <w:r>
+              <w:rPr>
+                <w:rFonts w:ascii="Courier New" w:eastAsia="Courier New" w:hAnsi="Courier New" w:cs="Courier New"/>
+                <w:color w:val="475569"/>
+                <w:sz w:val="18"/>
+                <w:szCs w:val="18"/>
+              </w:rPr>
+              <w:t>24}</w:t>
+            </w:r>
+          </w:p>
+        </w:tc>
+        <w:tc>
+          <w:tcPr>
+            <w:tcW w:w="3373" w:type="dxa"/>
+            <w:tcBorders>
+              <w:top w:val="single" w:sz="4" w:space="0" w:color="E2E8F0"/>
+              <w:left w:val="single" w:sz="4" w:space="0" w:color="E2E8F0"/>
+              <w:bottom w:val="single" w:sz="4" w:space="0" w:color="E2E8F0"/>
+              <w:right w:val="single" w:sz="4" w:space="0" w:color="E2E8F0"/>
+            </w:tcBorders>
+            <w:tcMar>
+              <w:top w:w="80" w:type="dxa"/>
+              <w:left w:w="120" w:type="dxa"/>
+              <w:bottom w:w="80" w:type="dxa"/>
+              <w:right w:w="120" w:type="dxa"/>
+            </w:tcMar>
+          </w:tcPr>
+          <w:p>
+            <w:r>
+              <w:rPr>
+                <w:color w:val="475569"/>
+                <w:sz w:val="20"/>
+                <w:szCs w:val="20"/>
+              </w:rPr>
+              <w:t>Bağlamsal araç çubuğu ikonları</w:t>
+            </w:r>
+          </w:p>
+        </w:tc>
+      </w:tr>
+      <w:tr>
+        <w:tc>
+          <w:tcPr>
+            <w:tcW w:w="1445" w:type="dxa"/>
+            <w:tcBorders>
+              <w:top w:val="single" w:sz="4" w:space="0" w:color="E2E8F0"/>
+              <w:left w:val="single" w:sz="4" w:space="0" w:color="E2E8F0"/>
+              <w:bottom w:val="single" w:sz="4" w:space="0" w:color="E2E8F0"/>
+              <w:right w:val="single" w:sz="4" w:space="0" w:color="E2E8F0"/>
+            </w:tcBorders>
+            <w:shd w:val="clear" w:color="auto" w:fill="FFFFFF"/>
+            <w:tcMar>
+              <w:top w:w="80" w:type="dxa"/>
+              <w:left w:w="120" w:type="dxa"/>
+              <w:bottom w:w="80" w:type="dxa"/>
+              <w:right w:w="120" w:type="dxa"/>
+            </w:tcMar>
+          </w:tcPr>
+          <w:p>
+            <w:pPr>
+              <w:jc w:val="center"/>
+            </w:pPr>
+            <w:r>
+              <w:rPr>
+                <w:b/>
+                <w:bCs/>
+                <w:color w:val="1A56DB"/>
+                <w:sz w:val="24"/>
+                <w:szCs w:val="24"/>
+              </w:rPr>
+              <w:t xml:space="preserve">18 </w:t>
+            </w:r>
+            <w:proofErr w:type="spellStart"/>
+            <w:r>
+              <w:rPr>
+                <w:b/>
+                <w:bCs/>
+                <w:color w:val="1A56DB"/>
+                <w:sz w:val="24"/>
+                <w:szCs w:val="24"/>
+              </w:rPr>
+              <w:t>px</w:t>
+            </w:r>
+            <w:proofErr w:type="spellEnd"/>
+          </w:p>
+        </w:tc>
+        <w:tc>
+          <w:tcPr>
+            <w:tcW w:w="2891" w:type="dxa"/>
+            <w:tcBorders>
+              <w:top w:val="single" w:sz="4" w:space="0" w:color="E2E8F0"/>
+              <w:left w:val="single" w:sz="4" w:space="0" w:color="E2E8F0"/>
+              <w:bottom w:val="single" w:sz="4" w:space="0" w:color="E2E8F0"/>
+              <w:right w:val="single" w:sz="4" w:space="0" w:color="E2E8F0"/>
+            </w:tcBorders>
+            <w:tcMar>
+              <w:top w:w="80" w:type="dxa"/>
+              <w:left w:w="120" w:type="dxa"/>
+              <w:bottom w:w="80" w:type="dxa"/>
+              <w:right w:w="120" w:type="dxa"/>
+            </w:tcMar>
+          </w:tcPr>
+          <w:p>
+            <w:r>
+              <w:rPr>
+                <w:b/>
+                <w:bCs/>
+                <w:color w:val="0F172A"/>
+                <w:sz w:val="20"/>
+                <w:szCs w:val="20"/>
+              </w:rPr>
+              <w:t>Panel akordiyonları</w:t>
+            </w:r>
+          </w:p>
+        </w:tc>
+        <w:tc>
+          <w:tcPr>
+            <w:tcW w:w="1927" w:type="dxa"/>
+            <w:tcBorders>
+              <w:top w:val="single" w:sz="4" w:space="0" w:color="E2E8F0"/>
+              <w:left w:val="single" w:sz="4" w:space="0" w:color="E2E8F0"/>
+              <w:bottom w:val="single" w:sz="4" w:space="0" w:color="E2E8F0"/>
+              <w:right w:val="single" w:sz="4" w:space="0" w:color="E2E8F0"/>
+            </w:tcBorders>
+            <w:shd w:val="clear" w:color="auto" w:fill="F3F4F6"/>
+            <w:tcMar>
+              <w:top w:w="80" w:type="dxa"/>
+              <w:left w:w="120" w:type="dxa"/>
+              <w:bottom w:w="80" w:type="dxa"/>
+              <w:right w:w="120" w:type="dxa"/>
+            </w:tcMar>
+          </w:tcPr>
+          <w:p>
+            <w:proofErr w:type="gramStart"/>
+            <w:r>
+              <w:rPr>
+                <w:rFonts w:ascii="Courier New" w:eastAsia="Courier New" w:hAnsi="Courier New" w:cs="Courier New"/>
+                <w:color w:val="475569"/>
+                <w:sz w:val="18"/>
+                <w:szCs w:val="18"/>
+              </w:rPr>
+              <w:t>size={</w:t>
+            </w:r>
+            <w:proofErr w:type="gramEnd"/>
+            <w:r>
+              <w:rPr>
+                <w:rFonts w:ascii="Courier New" w:eastAsia="Courier New" w:hAnsi="Courier New" w:cs="Courier New"/>
+                <w:color w:val="475569"/>
+                <w:sz w:val="18"/>
+                <w:szCs w:val="18"/>
+              </w:rPr>
+              <w:t>18}</w:t>
+            </w:r>
+          </w:p>
+        </w:tc>
+        <w:tc>
+          <w:tcPr>
+            <w:tcW w:w="3373" w:type="dxa"/>
+            <w:tcBorders>
+              <w:top w:val="single" w:sz="4" w:space="0" w:color="E2E8F0"/>
+              <w:left w:val="single" w:sz="4" w:space="0" w:color="E2E8F0"/>
+              <w:bottom w:val="single" w:sz="4" w:space="0" w:color="E2E8F0"/>
+              <w:right w:val="single" w:sz="4" w:space="0" w:color="E2E8F0"/>
+            </w:tcBorders>
+            <w:tcMar>
+              <w:top w:w="80" w:type="dxa"/>
+              <w:left w:w="120" w:type="dxa"/>
+              <w:bottom w:w="80" w:type="dxa"/>
+              <w:right w:w="120" w:type="dxa"/>
+            </w:tcMar>
+          </w:tcPr>
+          <w:p>
+            <w:r>
+              <w:rPr>
+                <w:color w:val="475569"/>
+                <w:sz w:val="20"/>
+                <w:szCs w:val="20"/>
+              </w:rPr>
+              <w:t>Sağ panel bölüm başlıkları</w:t>
+            </w:r>
+          </w:p>
+        </w:tc>
+      </w:tr>
+      <w:tr>
+        <w:tc>
+          <w:tcPr>
+            <w:tcW w:w="1445" w:type="dxa"/>
+            <w:tcBorders>
+              <w:top w:val="single" w:sz="4" w:space="0" w:color="E2E8F0"/>
+              <w:left w:val="single" w:sz="4" w:space="0" w:color="E2E8F0"/>
+              <w:bottom w:val="single" w:sz="4" w:space="0" w:color="E2E8F0"/>
+              <w:right w:val="single" w:sz="4" w:space="0" w:color="E2E8F0"/>
+            </w:tcBorders>
+            <w:shd w:val="clear" w:color="auto" w:fill="FFFFFF"/>
+            <w:tcMar>
+              <w:top w:w="80" w:type="dxa"/>
+              <w:left w:w="120" w:type="dxa"/>
+              <w:bottom w:w="80" w:type="dxa"/>
+              <w:right w:w="120" w:type="dxa"/>
+            </w:tcMar>
+          </w:tcPr>
+          <w:p>
+            <w:pPr>
+              <w:jc w:val="center"/>
+            </w:pPr>
+            <w:r>
+              <w:rPr>
+                <w:b/>
+                <w:bCs/>
+                <w:color w:val="1A56DB"/>
+                <w:sz w:val="24"/>
+                <w:szCs w:val="24"/>
+              </w:rPr>
+              <w:t xml:space="preserve">16 </w:t>
+            </w:r>
+            <w:proofErr w:type="spellStart"/>
+            <w:r>
+              <w:rPr>
+                <w:b/>
+                <w:bCs/>
+                <w:color w:val="1A56DB"/>
+                <w:sz w:val="24"/>
+                <w:szCs w:val="24"/>
+              </w:rPr>
+              <w:t>px</w:t>
+            </w:r>
+            <w:proofErr w:type="spellEnd"/>
+          </w:p>
+        </w:tc>
+        <w:tc>
+          <w:tcPr>
+            <w:tcW w:w="2891" w:type="dxa"/>
+            <w:tcBorders>
+              <w:top w:val="single" w:sz="4" w:space="0" w:color="E2E8F0"/>
+              <w:left w:val="single" w:sz="4" w:space="0" w:color="E2E8F0"/>
+              <w:bottom w:val="single" w:sz="4" w:space="0" w:color="E2E8F0"/>
+              <w:right w:val="single" w:sz="4" w:space="0" w:color="E2E8F0"/>
+            </w:tcBorders>
+            <w:tcMar>
+              <w:top w:w="80" w:type="dxa"/>
+              <w:left w:w="120" w:type="dxa"/>
+              <w:bottom w:w="80" w:type="dxa"/>
+              <w:right w:w="120" w:type="dxa"/>
+            </w:tcMar>
+          </w:tcPr>
+          <w:p>
+            <w:r>
+              <w:rPr>
+                <w:b/>
+                <w:bCs/>
+                <w:color w:val="0F172A"/>
+                <w:sz w:val="20"/>
+                <w:szCs w:val="20"/>
+              </w:rPr>
+              <w:t>Satır içi aksiyonlar</w:t>
+            </w:r>
+          </w:p>
+        </w:tc>
+        <w:tc>
+          <w:tcPr>
+            <w:tcW w:w="1927" w:type="dxa"/>
+            <w:tcBorders>
+              <w:top w:val="single" w:sz="4" w:space="0" w:color="E2E8F0"/>
+              <w:left w:val="single" w:sz="4" w:space="0" w:color="E2E8F0"/>
+              <w:bottom w:val="single" w:sz="4" w:space="0" w:color="E2E8F0"/>
+              <w:right w:val="single" w:sz="4" w:space="0" w:color="E2E8F0"/>
+            </w:tcBorders>
+            <w:shd w:val="clear" w:color="auto" w:fill="F3F4F6"/>
+            <w:tcMar>
+              <w:top w:w="80" w:type="dxa"/>
+              <w:left w:w="120" w:type="dxa"/>
+              <w:bottom w:w="80" w:type="dxa"/>
+              <w:right w:w="120" w:type="dxa"/>
+            </w:tcMar>
+          </w:tcPr>
+          <w:p>
+            <w:proofErr w:type="gramStart"/>
+            <w:r>
+              <w:rPr>
+                <w:rFonts w:ascii="Courier New" w:eastAsia="Courier New" w:hAnsi="Courier New" w:cs="Courier New"/>
+                <w:color w:val="475569"/>
+                <w:sz w:val="18"/>
+                <w:szCs w:val="18"/>
+              </w:rPr>
+              <w:t>size={</w:t>
+            </w:r>
+            <w:proofErr w:type="gramEnd"/>
+            <w:r>
+              <w:rPr>
+                <w:rFonts w:ascii="Courier New" w:eastAsia="Courier New" w:hAnsi="Courier New" w:cs="Courier New"/>
+                <w:color w:val="475569"/>
+                <w:sz w:val="18"/>
+                <w:szCs w:val="18"/>
+              </w:rPr>
+              <w:t>16}</w:t>
             </w:r>
           </w:p>
         </w:tc>
@@ -3300,7 +3980,29 @@
           <w:sz w:val="20"/>
           <w:szCs w:val="20"/>
         </w:rPr>
-        <w:t>Minimum tıklama alanı: Her zaman 40×40px. Görsel boyutu 16px olsa bile padding ile 40px'e tamamlanmalı. Aksi halde acemi kullanıcı ikonlara tıklayamaz.</w:t>
+        <w:t xml:space="preserve">Minimum tıklama alanı: Her zaman 40×40px. Görsel boyutu 16px olsa bile </w:t>
+      </w:r>
+      <w:proofErr w:type="spellStart"/>
+      <w:r>
+        <w:rPr>
+          <w:i/>
+          <w:iCs/>
+          <w:color w:val="0F172A"/>
+          <w:sz w:val="20"/>
+          <w:szCs w:val="20"/>
+        </w:rPr>
+        <w:t>padding</w:t>
+      </w:r>
+      <w:proofErr w:type="spellEnd"/>
+      <w:r>
+        <w:rPr>
+          <w:i/>
+          <w:iCs/>
+          <w:color w:val="0F172A"/>
+          <w:sz w:val="20"/>
+          <w:szCs w:val="20"/>
+        </w:rPr>
+        <w:t xml:space="preserve"> ile 40px'e tamamlanmalı. Aksi halde acemi kullanıcı ikonlara tıklayamaz.</w:t>
       </w:r>
     </w:p>
     <w:p>
@@ -3312,8 +4014,13 @@
       <w:pPr>
         <w:pStyle w:val="Balk3"/>
       </w:pPr>
-      <w:r>
-        <w:t>4.3  İkon kullanım kuralları</w:t>
+      <w:proofErr w:type="gramStart"/>
+      <w:r>
+        <w:t>4.3  İkon</w:t>
+      </w:r>
+      <w:proofErr w:type="gramEnd"/>
+      <w:r>
+        <w:t xml:space="preserve"> kullanım kuralları</w:t>
       </w:r>
     </w:p>
     <w:p>
@@ -3333,11 +4040,33 @@
         </w:rPr>
         <w:t xml:space="preserve">İkon asla yalnız değil — </w:t>
       </w:r>
-      <w:r>
-        <w:rPr>
-          <w:color w:val="475569"/>
-        </w:rPr>
-        <w:t>Toolbar ve panel içindeki her ikon yanında metin etiketi taşımalı. Tek istisnalar: Geri al, ilerle gibi evrensel tanınan aksiyonlar — bunlarda da tooltip şart.</w:t>
+      <w:proofErr w:type="spellStart"/>
+      <w:r>
+        <w:rPr>
+          <w:color w:val="475569"/>
+        </w:rPr>
+        <w:t>Toolbar</w:t>
+      </w:r>
+      <w:proofErr w:type="spellEnd"/>
+      <w:r>
+        <w:rPr>
+          <w:color w:val="475569"/>
+        </w:rPr>
+        <w:t xml:space="preserve"> ve panel içindeki her ikon yanında metin etiketi taşımalı. Tek istisnalar: Geri al, ilerle gibi evrensel tanınan aksiyonlar — bunlarda da </w:t>
+      </w:r>
+      <w:proofErr w:type="spellStart"/>
+      <w:r>
+        <w:rPr>
+          <w:color w:val="475569"/>
+        </w:rPr>
+        <w:t>tooltip</w:t>
+      </w:r>
+      <w:proofErr w:type="spellEnd"/>
+      <w:r>
+        <w:rPr>
+          <w:color w:val="475569"/>
+        </w:rPr>
+        <w:t xml:space="preserve"> şart.</w:t>
       </w:r>
     </w:p>
     <w:p>
@@ -3381,11 +4110,33 @@
         </w:rPr>
         <w:t xml:space="preserve">Tutarlı aile — </w:t>
       </w:r>
-      <w:r>
-        <w:rPr>
-          <w:color w:val="475569"/>
-        </w:rPr>
-        <w:t>Lucide'in outline seti. Farklı stilden tek bir ikon bile görsel bütünlüğü bozar.</w:t>
+      <w:proofErr w:type="spellStart"/>
+      <w:r>
+        <w:rPr>
+          <w:color w:val="475569"/>
+        </w:rPr>
+        <w:t>Lucide'in</w:t>
+      </w:r>
+      <w:proofErr w:type="spellEnd"/>
+      <w:r>
+        <w:rPr>
+          <w:color w:val="475569"/>
+        </w:rPr>
+        <w:t xml:space="preserve"> </w:t>
+      </w:r>
+      <w:proofErr w:type="spellStart"/>
+      <w:r>
+        <w:rPr>
+          <w:color w:val="475569"/>
+        </w:rPr>
+        <w:t>outline</w:t>
+      </w:r>
+      <w:proofErr w:type="spellEnd"/>
+      <w:r>
+        <w:rPr>
+          <w:color w:val="475569"/>
+        </w:rPr>
+        <w:t xml:space="preserve"> seti. Farklı stilden tek bir ikon bile görsel bütünlüğü bozar.</w:t>
       </w:r>
     </w:p>
     <w:p>
@@ -3397,19 +4148,57 @@
         </w:numPr>
         <w:spacing w:before="40" w:after="40"/>
       </w:pPr>
+      <w:proofErr w:type="spellStart"/>
       <w:r>
         <w:rPr>
           <w:b/>
           <w:bCs/>
           <w:color w:val="0F172A"/>
         </w:rPr>
-        <w:t xml:space="preserve">Tooltip zorunlu — </w:t>
-      </w:r>
-      <w:r>
-        <w:rPr>
-          <w:color w:val="475569"/>
-        </w:rPr>
-        <w:t>Etiket olmayan her ikona hover'da tooltip eklenir. 'Ne işe yarar?' sorusu cevaplanmalı.</w:t>
+        <w:t>Tooltip</w:t>
+      </w:r>
+      <w:proofErr w:type="spellEnd"/>
+      <w:r>
+        <w:rPr>
+          <w:b/>
+          <w:bCs/>
+          <w:color w:val="0F172A"/>
+        </w:rPr>
+        <w:t xml:space="preserve"> zorunlu — </w:t>
+      </w:r>
+      <w:r>
+        <w:rPr>
+          <w:color w:val="475569"/>
+        </w:rPr>
+        <w:t xml:space="preserve">Etiket olmayan her ikona </w:t>
+      </w:r>
+      <w:proofErr w:type="spellStart"/>
+      <w:r>
+        <w:rPr>
+          <w:color w:val="475569"/>
+        </w:rPr>
+        <w:t>hover'da</w:t>
+      </w:r>
+      <w:proofErr w:type="spellEnd"/>
+      <w:r>
+        <w:rPr>
+          <w:color w:val="475569"/>
+        </w:rPr>
+        <w:t xml:space="preserve"> </w:t>
+      </w:r>
+      <w:proofErr w:type="spellStart"/>
+      <w:r>
+        <w:rPr>
+          <w:color w:val="475569"/>
+        </w:rPr>
+        <w:t>tooltip</w:t>
+      </w:r>
+      <w:proofErr w:type="spellEnd"/>
+      <w:r>
+        <w:rPr>
+          <w:color w:val="475569"/>
+        </w:rPr>
+        <w:t xml:space="preserve"> eklenir. 'Ne işe yarar?' sorusu cevaplanmalı.</w:t>
       </w:r>
     </w:p>
     <w:p>
@@ -3421,8 +4210,13 @@
       <w:pPr>
         <w:pStyle w:val="Balk3"/>
       </w:pPr>
-      <w:r>
-        <w:t>4.4  Mevcut ikonlar ve önerilen değişiklikler</w:t>
+      <w:proofErr w:type="gramStart"/>
+      <w:r>
+        <w:t>4.4  Mevcut</w:t>
+      </w:r>
+      <w:proofErr w:type="gramEnd"/>
+      <w:r>
+        <w:t xml:space="preserve"> ikonlar ve önerilen değişiklikler</w:t>
       </w:r>
     </w:p>
     <w:p>
@@ -3595,6 +4389,7 @@
             </w:tcMar>
           </w:tcPr>
           <w:p>
+            <w:proofErr w:type="spellStart"/>
             <w:r>
               <w:rPr>
                 <w:rFonts w:ascii="Courier New" w:eastAsia="Courier New" w:hAnsi="Courier New" w:cs="Courier New"/>
@@ -3606,6 +4401,7 @@
               </w:rPr>
               <w:t>LayoutGrid</w:t>
             </w:r>
+            <w:proofErr w:type="spellEnd"/>
           </w:p>
         </w:tc>
         <w:tc>
@@ -3655,6 +4451,7 @@
             </w:tcMar>
           </w:tcPr>
           <w:p>
+            <w:proofErr w:type="spellStart"/>
             <w:r>
               <w:rPr>
                 <w:rFonts w:ascii="Courier New" w:eastAsia="Courier New" w:hAnsi="Courier New" w:cs="Courier New"/>
@@ -3664,6 +4461,7 @@
               </w:rPr>
               <w:t>Square</w:t>
             </w:r>
+            <w:proofErr w:type="spellEnd"/>
           </w:p>
         </w:tc>
         <w:tc>
@@ -3684,6 +4482,7 @@
             </w:tcMar>
           </w:tcPr>
           <w:p>
+            <w:proofErr w:type="spellStart"/>
             <w:r>
               <w:rPr>
                 <w:rFonts w:ascii="Courier New" w:eastAsia="Courier New" w:hAnsi="Courier New" w:cs="Courier New"/>
@@ -3695,6 +4494,7 @@
               </w:rPr>
               <w:t>RectangleHorizontal</w:t>
             </w:r>
+            <w:proofErr w:type="spellEnd"/>
           </w:p>
         </w:tc>
         <w:tc>
@@ -3744,6 +4544,7 @@
             </w:tcMar>
           </w:tcPr>
           <w:p>
+            <w:proofErr w:type="spellStart"/>
             <w:r>
               <w:rPr>
                 <w:rFonts w:ascii="Courier New" w:eastAsia="Courier New" w:hAnsi="Courier New" w:cs="Courier New"/>
@@ -3753,6 +4554,7 @@
               </w:rPr>
               <w:t>Tag</w:t>
             </w:r>
+            <w:proofErr w:type="spellEnd"/>
           </w:p>
         </w:tc>
         <w:tc>
@@ -3773,6 +4575,7 @@
             </w:tcMar>
           </w:tcPr>
           <w:p>
+            <w:proofErr w:type="spellStart"/>
             <w:r>
               <w:rPr>
                 <w:rFonts w:ascii="Courier New" w:eastAsia="Courier New" w:hAnsi="Courier New" w:cs="Courier New"/>
@@ -3782,86 +4585,9 @@
                 <w:sz w:val="20"/>
                 <w:szCs w:val="20"/>
               </w:rPr>
-              <w:t>PriceTag / BadgeDollarSign</w:t>
-            </w:r>
-          </w:p>
-        </w:tc>
-        <w:tc>
-          <w:tcPr>
-            <w:tcW w:w="4337" w:type="dxa"/>
-            <w:tcBorders>
-              <w:top w:val="single" w:sz="4" w:space="0" w:color="E2E8F0"/>
-              <w:left w:val="single" w:sz="4" w:space="0" w:color="E2E8F0"/>
-              <w:bottom w:val="single" w:sz="4" w:space="0" w:color="E2E8F0"/>
-              <w:right w:val="single" w:sz="4" w:space="0" w:color="E2E8F0"/>
-            </w:tcBorders>
-            <w:tcMar>
-              <w:top w:w="80" w:type="dxa"/>
-              <w:left w:w="120" w:type="dxa"/>
-              <w:bottom w:w="80" w:type="dxa"/>
-              <w:right w:w="120" w:type="dxa"/>
-            </w:tcMar>
-          </w:tcPr>
-          <w:p>
-            <w:r>
-              <w:rPr>
-                <w:color w:val="475569"/>
-                <w:sz w:val="20"/>
-                <w:szCs w:val="20"/>
-              </w:rPr>
-              <w:t>Fiyat kutusu için daha açıklayıcı</w:t>
-            </w:r>
-          </w:p>
-        </w:tc>
-      </w:tr>
-      <w:tr>
-        <w:tc>
-          <w:tcPr>
-            <w:tcW w:w="2409" w:type="dxa"/>
-            <w:tcBorders>
-              <w:top w:val="single" w:sz="4" w:space="0" w:color="E2E8F0"/>
-              <w:left w:val="single" w:sz="4" w:space="0" w:color="E2E8F0"/>
-              <w:bottom w:val="single" w:sz="4" w:space="0" w:color="E2E8F0"/>
-              <w:right w:val="single" w:sz="4" w:space="0" w:color="E2E8F0"/>
-            </w:tcBorders>
-            <w:shd w:val="clear" w:color="auto" w:fill="FEF2F2"/>
-            <w:tcMar>
-              <w:top w:w="80" w:type="dxa"/>
-              <w:left w:w="120" w:type="dxa"/>
-              <w:bottom w:w="80" w:type="dxa"/>
-              <w:right w:w="120" w:type="dxa"/>
-            </w:tcMar>
-          </w:tcPr>
-          <w:p>
-            <w:r>
-              <w:rPr>
-                <w:rFonts w:ascii="Courier New" w:eastAsia="Courier New" w:hAnsi="Courier New" w:cs="Courier New"/>
-                <w:color w:val="DC2626"/>
-                <w:sz w:val="20"/>
-                <w:szCs w:val="20"/>
-              </w:rPr>
-              <w:t>— (yok)</w:t>
-            </w:r>
-          </w:p>
-        </w:tc>
-        <w:tc>
-          <w:tcPr>
-            <w:tcW w:w="2891" w:type="dxa"/>
-            <w:tcBorders>
-              <w:top w:val="single" w:sz="4" w:space="0" w:color="E2E8F0"/>
-              <w:left w:val="single" w:sz="4" w:space="0" w:color="E2E8F0"/>
-              <w:bottom w:val="single" w:sz="4" w:space="0" w:color="E2E8F0"/>
-              <w:right w:val="single" w:sz="4" w:space="0" w:color="E2E8F0"/>
-            </w:tcBorders>
-            <w:shd w:val="clear" w:color="auto" w:fill="F0FDF4"/>
-            <w:tcMar>
-              <w:top w:w="80" w:type="dxa"/>
-              <w:left w:w="120" w:type="dxa"/>
-              <w:bottom w:w="80" w:type="dxa"/>
-              <w:right w:w="120" w:type="dxa"/>
-            </w:tcMar>
-          </w:tcPr>
-          <w:p>
+              <w:t>PriceTag</w:t>
+            </w:r>
+            <w:proofErr w:type="spellEnd"/>
             <w:r>
               <w:rPr>
                 <w:rFonts w:ascii="Courier New" w:eastAsia="Courier New" w:hAnsi="Courier New" w:cs="Courier New"/>
@@ -3871,86 +4597,9 @@
                 <w:sz w:val="20"/>
                 <w:szCs w:val="20"/>
               </w:rPr>
-              <w:t>FileSpreadsheet</w:t>
-            </w:r>
-          </w:p>
-        </w:tc>
-        <w:tc>
-          <w:tcPr>
-            <w:tcW w:w="4337" w:type="dxa"/>
-            <w:tcBorders>
-              <w:top w:val="single" w:sz="4" w:space="0" w:color="E2E8F0"/>
-              <w:left w:val="single" w:sz="4" w:space="0" w:color="E2E8F0"/>
-              <w:bottom w:val="single" w:sz="4" w:space="0" w:color="E2E8F0"/>
-              <w:right w:val="single" w:sz="4" w:space="0" w:color="E2E8F0"/>
-            </w:tcBorders>
-            <w:tcMar>
-              <w:top w:w="80" w:type="dxa"/>
-              <w:left w:w="120" w:type="dxa"/>
-              <w:bottom w:w="80" w:type="dxa"/>
-              <w:right w:w="120" w:type="dxa"/>
-            </w:tcMar>
-          </w:tcPr>
-          <w:p>
-            <w:r>
-              <w:rPr>
-                <w:color w:val="475569"/>
-                <w:sz w:val="20"/>
-                <w:szCs w:val="20"/>
-              </w:rPr>
-              <w:t>Excel yükleme alanı için</w:t>
-            </w:r>
-          </w:p>
-        </w:tc>
-      </w:tr>
-      <w:tr>
-        <w:tc>
-          <w:tcPr>
-            <w:tcW w:w="2409" w:type="dxa"/>
-            <w:tcBorders>
-              <w:top w:val="single" w:sz="4" w:space="0" w:color="E2E8F0"/>
-              <w:left w:val="single" w:sz="4" w:space="0" w:color="E2E8F0"/>
-              <w:bottom w:val="single" w:sz="4" w:space="0" w:color="E2E8F0"/>
-              <w:right w:val="single" w:sz="4" w:space="0" w:color="E2E8F0"/>
-            </w:tcBorders>
-            <w:shd w:val="clear" w:color="auto" w:fill="FEF2F2"/>
-            <w:tcMar>
-              <w:top w:w="80" w:type="dxa"/>
-              <w:left w:w="120" w:type="dxa"/>
-              <w:bottom w:w="80" w:type="dxa"/>
-              <w:right w:w="120" w:type="dxa"/>
-            </w:tcMar>
-          </w:tcPr>
-          <w:p>
-            <w:r>
-              <w:rPr>
-                <w:rFonts w:ascii="Courier New" w:eastAsia="Courier New" w:hAnsi="Courier New" w:cs="Courier New"/>
-                <w:color w:val="DC2626"/>
-                <w:sz w:val="20"/>
-                <w:szCs w:val="20"/>
-              </w:rPr>
-              <w:t>— (yok)</w:t>
-            </w:r>
-          </w:p>
-        </w:tc>
-        <w:tc>
-          <w:tcPr>
-            <w:tcW w:w="2891" w:type="dxa"/>
-            <w:tcBorders>
-              <w:top w:val="single" w:sz="4" w:space="0" w:color="E2E8F0"/>
-              <w:left w:val="single" w:sz="4" w:space="0" w:color="E2E8F0"/>
-              <w:bottom w:val="single" w:sz="4" w:space="0" w:color="E2E8F0"/>
-              <w:right w:val="single" w:sz="4" w:space="0" w:color="E2E8F0"/>
-            </w:tcBorders>
-            <w:shd w:val="clear" w:color="auto" w:fill="F0FDF4"/>
-            <w:tcMar>
-              <w:top w:w="80" w:type="dxa"/>
-              <w:left w:w="120" w:type="dxa"/>
-              <w:bottom w:w="80" w:type="dxa"/>
-              <w:right w:w="120" w:type="dxa"/>
-            </w:tcMar>
-          </w:tcPr>
-          <w:p>
+              <w:t xml:space="preserve"> / </w:t>
+            </w:r>
+            <w:proofErr w:type="spellStart"/>
             <w:r>
               <w:rPr>
                 <w:rFonts w:ascii="Courier New" w:eastAsia="Courier New" w:hAnsi="Courier New" w:cs="Courier New"/>
@@ -3960,8 +4609,191 @@
                 <w:sz w:val="20"/>
                 <w:szCs w:val="20"/>
               </w:rPr>
+              <w:t>BadgeDollarSign</w:t>
+            </w:r>
+            <w:proofErr w:type="spellEnd"/>
+          </w:p>
+        </w:tc>
+        <w:tc>
+          <w:tcPr>
+            <w:tcW w:w="4337" w:type="dxa"/>
+            <w:tcBorders>
+              <w:top w:val="single" w:sz="4" w:space="0" w:color="E2E8F0"/>
+              <w:left w:val="single" w:sz="4" w:space="0" w:color="E2E8F0"/>
+              <w:bottom w:val="single" w:sz="4" w:space="0" w:color="E2E8F0"/>
+              <w:right w:val="single" w:sz="4" w:space="0" w:color="E2E8F0"/>
+            </w:tcBorders>
+            <w:tcMar>
+              <w:top w:w="80" w:type="dxa"/>
+              <w:left w:w="120" w:type="dxa"/>
+              <w:bottom w:w="80" w:type="dxa"/>
+              <w:right w:w="120" w:type="dxa"/>
+            </w:tcMar>
+          </w:tcPr>
+          <w:p>
+            <w:r>
+              <w:rPr>
+                <w:color w:val="475569"/>
+                <w:sz w:val="20"/>
+                <w:szCs w:val="20"/>
+              </w:rPr>
+              <w:t>Fiyat kutusu için daha açıklayıcı</w:t>
+            </w:r>
+          </w:p>
+        </w:tc>
+      </w:tr>
+      <w:tr>
+        <w:tc>
+          <w:tcPr>
+            <w:tcW w:w="2409" w:type="dxa"/>
+            <w:tcBorders>
+              <w:top w:val="single" w:sz="4" w:space="0" w:color="E2E8F0"/>
+              <w:left w:val="single" w:sz="4" w:space="0" w:color="E2E8F0"/>
+              <w:bottom w:val="single" w:sz="4" w:space="0" w:color="E2E8F0"/>
+              <w:right w:val="single" w:sz="4" w:space="0" w:color="E2E8F0"/>
+            </w:tcBorders>
+            <w:shd w:val="clear" w:color="auto" w:fill="FEF2F2"/>
+            <w:tcMar>
+              <w:top w:w="80" w:type="dxa"/>
+              <w:left w:w="120" w:type="dxa"/>
+              <w:bottom w:w="80" w:type="dxa"/>
+              <w:right w:w="120" w:type="dxa"/>
+            </w:tcMar>
+          </w:tcPr>
+          <w:p>
+            <w:r>
+              <w:rPr>
+                <w:rFonts w:ascii="Courier New" w:eastAsia="Courier New" w:hAnsi="Courier New" w:cs="Courier New"/>
+                <w:color w:val="DC2626"/>
+                <w:sz w:val="20"/>
+                <w:szCs w:val="20"/>
+              </w:rPr>
+              <w:t>— (yok)</w:t>
+            </w:r>
+          </w:p>
+        </w:tc>
+        <w:tc>
+          <w:tcPr>
+            <w:tcW w:w="2891" w:type="dxa"/>
+            <w:tcBorders>
+              <w:top w:val="single" w:sz="4" w:space="0" w:color="E2E8F0"/>
+              <w:left w:val="single" w:sz="4" w:space="0" w:color="E2E8F0"/>
+              <w:bottom w:val="single" w:sz="4" w:space="0" w:color="E2E8F0"/>
+              <w:right w:val="single" w:sz="4" w:space="0" w:color="E2E8F0"/>
+            </w:tcBorders>
+            <w:shd w:val="clear" w:color="auto" w:fill="F0FDF4"/>
+            <w:tcMar>
+              <w:top w:w="80" w:type="dxa"/>
+              <w:left w:w="120" w:type="dxa"/>
+              <w:bottom w:w="80" w:type="dxa"/>
+              <w:right w:w="120" w:type="dxa"/>
+            </w:tcMar>
+          </w:tcPr>
+          <w:p>
+            <w:proofErr w:type="spellStart"/>
+            <w:r>
+              <w:rPr>
+                <w:rFonts w:ascii="Courier New" w:eastAsia="Courier New" w:hAnsi="Courier New" w:cs="Courier New"/>
+                <w:b/>
+                <w:bCs/>
+                <w:color w:val="16A34A"/>
+                <w:sz w:val="20"/>
+                <w:szCs w:val="20"/>
+              </w:rPr>
+              <w:t>FileSpreadsheet</w:t>
+            </w:r>
+            <w:proofErr w:type="spellEnd"/>
+          </w:p>
+        </w:tc>
+        <w:tc>
+          <w:tcPr>
+            <w:tcW w:w="4337" w:type="dxa"/>
+            <w:tcBorders>
+              <w:top w:val="single" w:sz="4" w:space="0" w:color="E2E8F0"/>
+              <w:left w:val="single" w:sz="4" w:space="0" w:color="E2E8F0"/>
+              <w:bottom w:val="single" w:sz="4" w:space="0" w:color="E2E8F0"/>
+              <w:right w:val="single" w:sz="4" w:space="0" w:color="E2E8F0"/>
+            </w:tcBorders>
+            <w:tcMar>
+              <w:top w:w="80" w:type="dxa"/>
+              <w:left w:w="120" w:type="dxa"/>
+              <w:bottom w:w="80" w:type="dxa"/>
+              <w:right w:w="120" w:type="dxa"/>
+            </w:tcMar>
+          </w:tcPr>
+          <w:p>
+            <w:r>
+              <w:rPr>
+                <w:color w:val="475569"/>
+                <w:sz w:val="20"/>
+                <w:szCs w:val="20"/>
+              </w:rPr>
+              <w:t>Excel yükleme alanı için</w:t>
+            </w:r>
+          </w:p>
+        </w:tc>
+      </w:tr>
+      <w:tr>
+        <w:tc>
+          <w:tcPr>
+            <w:tcW w:w="2409" w:type="dxa"/>
+            <w:tcBorders>
+              <w:top w:val="single" w:sz="4" w:space="0" w:color="E2E8F0"/>
+              <w:left w:val="single" w:sz="4" w:space="0" w:color="E2E8F0"/>
+              <w:bottom w:val="single" w:sz="4" w:space="0" w:color="E2E8F0"/>
+              <w:right w:val="single" w:sz="4" w:space="0" w:color="E2E8F0"/>
+            </w:tcBorders>
+            <w:shd w:val="clear" w:color="auto" w:fill="FEF2F2"/>
+            <w:tcMar>
+              <w:top w:w="80" w:type="dxa"/>
+              <w:left w:w="120" w:type="dxa"/>
+              <w:bottom w:w="80" w:type="dxa"/>
+              <w:right w:w="120" w:type="dxa"/>
+            </w:tcMar>
+          </w:tcPr>
+          <w:p>
+            <w:r>
+              <w:rPr>
+                <w:rFonts w:ascii="Courier New" w:eastAsia="Courier New" w:hAnsi="Courier New" w:cs="Courier New"/>
+                <w:color w:val="DC2626"/>
+                <w:sz w:val="20"/>
+                <w:szCs w:val="20"/>
+              </w:rPr>
+              <w:t>— (yok)</w:t>
+            </w:r>
+          </w:p>
+        </w:tc>
+        <w:tc>
+          <w:tcPr>
+            <w:tcW w:w="2891" w:type="dxa"/>
+            <w:tcBorders>
+              <w:top w:val="single" w:sz="4" w:space="0" w:color="E2E8F0"/>
+              <w:left w:val="single" w:sz="4" w:space="0" w:color="E2E8F0"/>
+              <w:bottom w:val="single" w:sz="4" w:space="0" w:color="E2E8F0"/>
+              <w:right w:val="single" w:sz="4" w:space="0" w:color="E2E8F0"/>
+            </w:tcBorders>
+            <w:shd w:val="clear" w:color="auto" w:fill="F0FDF4"/>
+            <w:tcMar>
+              <w:top w:w="80" w:type="dxa"/>
+              <w:left w:w="120" w:type="dxa"/>
+              <w:bottom w:w="80" w:type="dxa"/>
+              <w:right w:w="120" w:type="dxa"/>
+            </w:tcMar>
+          </w:tcPr>
+          <w:p>
+            <w:proofErr w:type="spellStart"/>
+            <w:r>
+              <w:rPr>
+                <w:rFonts w:ascii="Courier New" w:eastAsia="Courier New" w:hAnsi="Courier New" w:cs="Courier New"/>
+                <w:b/>
+                <w:bCs/>
+                <w:color w:val="16A34A"/>
+                <w:sz w:val="20"/>
+                <w:szCs w:val="20"/>
+              </w:rPr>
               <w:t>LayoutTemplate</w:t>
             </w:r>
+            <w:proofErr w:type="spellEnd"/>
           </w:p>
         </w:tc>
         <w:tc>
@@ -4125,8 +4957,13 @@
       <w:pPr>
         <w:pStyle w:val="Balk3"/>
       </w:pPr>
-      <w:r>
-        <w:t>5.1  Buton türleri</w:t>
+      <w:proofErr w:type="gramStart"/>
+      <w:r>
+        <w:t>5.1  Buton</w:t>
+      </w:r>
+      <w:proofErr w:type="gramEnd"/>
+      <w:r>
+        <w:t xml:space="preserve"> türleri</w:t>
       </w:r>
     </w:p>
     <w:p>
@@ -4391,7 +5228,25 @@
                 <w:sz w:val="20"/>
                 <w:szCs w:val="20"/>
               </w:rPr>
-              <w:t>Çerçeveli — border #e2e8f0</w:t>
+              <w:t xml:space="preserve">Çerçeveli — </w:t>
+            </w:r>
+            <w:proofErr w:type="spellStart"/>
+            <w:r>
+              <w:rPr>
+                <w:color w:val="475569"/>
+                <w:sz w:val="20"/>
+                <w:szCs w:val="20"/>
+              </w:rPr>
+              <w:t>border</w:t>
+            </w:r>
+            <w:proofErr w:type="spellEnd"/>
+            <w:r>
+              <w:rPr>
+                <w:color w:val="475569"/>
+                <w:sz w:val="20"/>
+                <w:szCs w:val="20"/>
+              </w:rPr>
+              <w:t xml:space="preserve"> #e2e8f0</w:t>
             </w:r>
           </w:p>
         </w:tc>
@@ -4418,7 +5273,25 @@
                 <w:sz w:val="20"/>
                 <w:szCs w:val="20"/>
               </w:rPr>
-              <w:t>Destekleyici aksiyon. Önizle, Değiştir, Geri dön.</w:t>
+              <w:t xml:space="preserve">Destekleyici aksiyon. </w:t>
+            </w:r>
+            <w:proofErr w:type="spellStart"/>
+            <w:r>
+              <w:rPr>
+                <w:color w:val="475569"/>
+                <w:sz w:val="20"/>
+                <w:szCs w:val="20"/>
+              </w:rPr>
+              <w:t>Önizle</w:t>
+            </w:r>
+            <w:proofErr w:type="spellEnd"/>
+            <w:r>
+              <w:rPr>
+                <w:color w:val="475569"/>
+                <w:sz w:val="20"/>
+                <w:szCs w:val="20"/>
+              </w:rPr>
+              <w:t>, Değiştir, Geri dön.</w:t>
             </w:r>
           </w:p>
         </w:tc>
@@ -4590,7 +5463,25 @@
                 <w:sz w:val="20"/>
                 <w:szCs w:val="20"/>
               </w:rPr>
-              <w:t>Sil, Temizle, Sıfırla. Her zaman onay modalı açar.</w:t>
+              <w:t xml:space="preserve">Sil, Temizle, Sıfırla. Her zaman onay </w:t>
+            </w:r>
+            <w:proofErr w:type="spellStart"/>
+            <w:r>
+              <w:rPr>
+                <w:color w:val="475569"/>
+                <w:sz w:val="20"/>
+                <w:szCs w:val="20"/>
+              </w:rPr>
+              <w:t>modalı</w:t>
+            </w:r>
+            <w:proofErr w:type="spellEnd"/>
+            <w:r>
+              <w:rPr>
+                <w:color w:val="475569"/>
+                <w:sz w:val="20"/>
+                <w:szCs w:val="20"/>
+              </w:rPr>
+              <w:t xml:space="preserve"> açar.</w:t>
             </w:r>
           </w:p>
         </w:tc>
@@ -4691,8 +5582,13 @@
       <w:pPr>
         <w:pStyle w:val="Balk3"/>
       </w:pPr>
-      <w:r>
-        <w:t>5.2  Boyut kuralları</w:t>
+      <w:proofErr w:type="gramStart"/>
+      <w:r>
+        <w:t>5.2  Boyut</w:t>
+      </w:r>
+      <w:proofErr w:type="gramEnd"/>
+      <w:r>
+        <w:t xml:space="preserve"> kuralları</w:t>
       </w:r>
     </w:p>
     <w:p>
@@ -4716,7 +5612,21 @@
         <w:rPr>
           <w:color w:val="475569"/>
         </w:rPr>
-        <w:t>Birincil ve ikincil butonlar 36px. Hayalet butonlar 32px. Toolbar butonları 40px (ikon + etiket).</w:t>
+        <w:t xml:space="preserve">Birincil ve ikincil butonlar 36px. Hayalet butonlar 32px. </w:t>
+      </w:r>
+      <w:proofErr w:type="spellStart"/>
+      <w:r>
+        <w:rPr>
+          <w:color w:val="475569"/>
+        </w:rPr>
+        <w:t>Toolbar</w:t>
+      </w:r>
+      <w:proofErr w:type="spellEnd"/>
+      <w:r>
+        <w:rPr>
+          <w:color w:val="475569"/>
+        </w:rPr>
+        <w:t xml:space="preserve"> butonları 40px (ikon + etiket).</w:t>
       </w:r>
     </w:p>
     <w:p>
@@ -4736,11 +5646,47 @@
         </w:rPr>
         <w:t xml:space="preserve">Minimum genişlik — </w:t>
       </w:r>
-      <w:r>
-        <w:rPr>
-          <w:color w:val="475569"/>
-        </w:rPr>
-        <w:t>Toolbar butonu minimum 56px. Panel butonu panel genişliğinin %100'ü (full width).</w:t>
+      <w:proofErr w:type="spellStart"/>
+      <w:r>
+        <w:rPr>
+          <w:color w:val="475569"/>
+        </w:rPr>
+        <w:t>Toolbar</w:t>
+      </w:r>
+      <w:proofErr w:type="spellEnd"/>
+      <w:r>
+        <w:rPr>
+          <w:color w:val="475569"/>
+        </w:rPr>
+        <w:t xml:space="preserve"> butonu minimum 56px. Panel butonu panel genişliğinin %100'ü (</w:t>
+      </w:r>
+      <w:proofErr w:type="spellStart"/>
+      <w:r>
+        <w:rPr>
+          <w:color w:val="475569"/>
+        </w:rPr>
+        <w:t>full</w:t>
+      </w:r>
+      <w:proofErr w:type="spellEnd"/>
+      <w:r>
+        <w:rPr>
+          <w:color w:val="475569"/>
+        </w:rPr>
+        <w:t xml:space="preserve"> </w:t>
+      </w:r>
+      <w:proofErr w:type="spellStart"/>
+      <w:r>
+        <w:rPr>
+          <w:color w:val="475569"/>
+        </w:rPr>
+        <w:t>width</w:t>
+      </w:r>
+      <w:proofErr w:type="spellEnd"/>
+      <w:r>
+        <w:rPr>
+          <w:color w:val="475569"/>
+        </w:rPr>
+        <w:t>).</w:t>
       </w:r>
     </w:p>
     <w:p>
@@ -4752,13 +5698,23 @@
         </w:numPr>
         <w:spacing w:before="40" w:after="40"/>
       </w:pPr>
+      <w:proofErr w:type="spellStart"/>
       <w:r>
         <w:rPr>
           <w:b/>
           <w:bCs/>
           <w:color w:val="0F172A"/>
         </w:rPr>
-        <w:t xml:space="preserve">Padding — </w:t>
+        <w:t>Padding</w:t>
+      </w:r>
+      <w:proofErr w:type="spellEnd"/>
+      <w:r>
+        <w:rPr>
+          <w:b/>
+          <w:bCs/>
+          <w:color w:val="0F172A"/>
+        </w:rPr>
+        <w:t xml:space="preserve"> — </w:t>
       </w:r>
       <w:r>
         <w:rPr>
@@ -4776,19 +5732,61 @@
         </w:numPr>
         <w:spacing w:before="40" w:after="40"/>
       </w:pPr>
+      <w:proofErr w:type="spellStart"/>
       <w:r>
         <w:rPr>
           <w:b/>
           <w:bCs/>
           <w:color w:val="0F172A"/>
         </w:rPr>
-        <w:t xml:space="preserve">Border radius — </w:t>
-      </w:r>
-      <w:r>
-        <w:rPr>
-          <w:color w:val="475569"/>
-        </w:rPr>
-        <w:t>6px. Köşeli (0px) veya tam yuvarlak (pill) kullanılmaz.</w:t>
+        <w:t>Border</w:t>
+      </w:r>
+      <w:proofErr w:type="spellEnd"/>
+      <w:r>
+        <w:rPr>
+          <w:b/>
+          <w:bCs/>
+          <w:color w:val="0F172A"/>
+        </w:rPr>
+        <w:t xml:space="preserve"> </w:t>
+      </w:r>
+      <w:proofErr w:type="spellStart"/>
+      <w:r>
+        <w:rPr>
+          <w:b/>
+          <w:bCs/>
+          <w:color w:val="0F172A"/>
+        </w:rPr>
+        <w:t>radius</w:t>
+      </w:r>
+      <w:proofErr w:type="spellEnd"/>
+      <w:r>
+        <w:rPr>
+          <w:b/>
+          <w:bCs/>
+          <w:color w:val="0F172A"/>
+        </w:rPr>
+        <w:t xml:space="preserve"> — </w:t>
+      </w:r>
+      <w:r>
+        <w:rPr>
+          <w:color w:val="475569"/>
+        </w:rPr>
+        <w:t>6px. Köşeli (0px) veya tam yuvarlak (</w:t>
+      </w:r>
+      <w:proofErr w:type="spellStart"/>
+      <w:r>
+        <w:rPr>
+          <w:color w:val="475569"/>
+        </w:rPr>
+        <w:t>pill</w:t>
+      </w:r>
+      <w:proofErr w:type="spellEnd"/>
+      <w:r>
+        <w:rPr>
+          <w:color w:val="475569"/>
+        </w:rPr>
+        <w:t>) kullanılmaz.</w:t>
       </w:r>
     </w:p>
     <w:p>
@@ -4813,7 +5811,29 @@
           <w:sz w:val="20"/>
           <w:szCs w:val="20"/>
         </w:rPr>
-        <w:t>Tehlikeli aksiyon kuralı: 'Havuzu Temizle', 'Sıfırla', 'Sil' gibi geri alınamaz her aksiyon, tıklandığında onay modalı açmalıdır. Onaysız silme işlemi yasaktır.</w:t>
+        <w:t xml:space="preserve">Tehlikeli aksiyon kuralı: 'Havuzu Temizle', 'Sıfırla', 'Sil' gibi geri alınamaz her aksiyon, tıklandığında onay </w:t>
+      </w:r>
+      <w:proofErr w:type="spellStart"/>
+      <w:r>
+        <w:rPr>
+          <w:i/>
+          <w:iCs/>
+          <w:color w:val="0F172A"/>
+          <w:sz w:val="20"/>
+          <w:szCs w:val="20"/>
+        </w:rPr>
+        <w:t>modalı</w:t>
+      </w:r>
+      <w:proofErr w:type="spellEnd"/>
+      <w:r>
+        <w:rPr>
+          <w:i/>
+          <w:iCs/>
+          <w:color w:val="0F172A"/>
+          <w:sz w:val="20"/>
+          <w:szCs w:val="20"/>
+        </w:rPr>
+        <w:t xml:space="preserve"> açmalıdır. Onaysız silme işlemi yasaktır.</w:t>
       </w:r>
     </w:p>
     <w:p>
@@ -4834,9 +5854,19 @@
       <w:pPr>
         <w:pStyle w:val="Balk3"/>
       </w:pPr>
-      <w:r>
-        <w:t>6.1  İki katmanlı layout</w:t>
-      </w:r>
+      <w:proofErr w:type="gramStart"/>
+      <w:r>
+        <w:t>6.1  İki</w:t>
+      </w:r>
+      <w:proofErr w:type="gramEnd"/>
+      <w:r>
+        <w:t xml:space="preserve"> katmanlı </w:t>
+      </w:r>
+      <w:proofErr w:type="spellStart"/>
+      <w:r>
+        <w:t>layout</w:t>
+      </w:r>
+      <w:proofErr w:type="spellEnd"/>
     </w:p>
     <w:p>
       <w:pPr>
@@ -5025,8 +6055,18 @@
                 <w:sz w:val="20"/>
                 <w:szCs w:val="20"/>
               </w:rPr>
-              <w:t>Kanvas üstü — bağlamsal toolbar</w:t>
-            </w:r>
+              <w:t xml:space="preserve">Kanvas üstü — bağlamsal </w:t>
+            </w:r>
+            <w:proofErr w:type="spellStart"/>
+            <w:r>
+              <w:rPr>
+                <w:color w:val="0F172A"/>
+                <w:sz w:val="20"/>
+                <w:szCs w:val="20"/>
+              </w:rPr>
+              <w:t>toolbar</w:t>
+            </w:r>
+            <w:proofErr w:type="spellEnd"/>
           </w:p>
         </w:tc>
         <w:tc>
@@ -5111,8 +6151,18 @@
                 <w:sz w:val="20"/>
                 <w:szCs w:val="20"/>
               </w:rPr>
-              <w:t>Sağ panel — akordiyonlu</w:t>
-            </w:r>
+              <w:t xml:space="preserve">Sağ panel — </w:t>
+            </w:r>
+            <w:proofErr w:type="spellStart"/>
+            <w:r>
+              <w:rPr>
+                <w:color w:val="0F172A"/>
+                <w:sz w:val="20"/>
+                <w:szCs w:val="20"/>
+              </w:rPr>
+              <w:t>akordiyonlu</w:t>
+            </w:r>
+            <w:proofErr w:type="spellEnd"/>
           </w:p>
         </w:tc>
         <w:tc>
@@ -5153,8 +6203,21 @@
       <w:pPr>
         <w:pStyle w:val="Balk3"/>
       </w:pPr>
-      <w:r>
-        <w:t>6.2  Hızlı erişim toolbar kuralları</w:t>
+      <w:proofErr w:type="gramStart"/>
+      <w:r>
+        <w:t>6.2  Hızlı</w:t>
+      </w:r>
+      <w:proofErr w:type="gramEnd"/>
+      <w:r>
+        <w:t xml:space="preserve"> erişim </w:t>
+      </w:r>
+      <w:proofErr w:type="spellStart"/>
+      <w:r>
+        <w:t>toolbar</w:t>
+      </w:r>
+      <w:proofErr w:type="spellEnd"/>
+      <w:r>
+        <w:t xml:space="preserve"> kuralları</w:t>
       </w:r>
     </w:p>
     <w:p>
@@ -5198,11 +6261,33 @@
         </w:rPr>
         <w:t xml:space="preserve">Bağlam duyarlı — </w:t>
       </w:r>
-      <w:r>
-        <w:rPr>
-          <w:color w:val="475569"/>
-        </w:rPr>
-        <w:t>Arkaplan seçilince arkaplan araçları, ürün alanı seçilince alan araçları. Kanvasta seçim yokken genel araçlar.</w:t>
+      <w:proofErr w:type="spellStart"/>
+      <w:r>
+        <w:rPr>
+          <w:color w:val="475569"/>
+        </w:rPr>
+        <w:t>Arkaplan</w:t>
+      </w:r>
+      <w:proofErr w:type="spellEnd"/>
+      <w:r>
+        <w:rPr>
+          <w:color w:val="475569"/>
+        </w:rPr>
+        <w:t xml:space="preserve"> seçilince </w:t>
+      </w:r>
+      <w:proofErr w:type="spellStart"/>
+      <w:r>
+        <w:rPr>
+          <w:color w:val="475569"/>
+        </w:rPr>
+        <w:t>arkaplan</w:t>
+      </w:r>
+      <w:proofErr w:type="spellEnd"/>
+      <w:r>
+        <w:rPr>
+          <w:color w:val="475569"/>
+        </w:rPr>
+        <w:t xml:space="preserve"> araçları, ürün alanı seçilince alan araçları. Kanvasta seçim yokken genel araçlar.</w:t>
       </w:r>
     </w:p>
     <w:p>
@@ -5222,11 +6307,19 @@
         </w:rPr>
         <w:t xml:space="preserve">İkon + kısa etiket — </w:t>
       </w:r>
-      <w:r>
-        <w:rPr>
-          <w:color w:val="475569"/>
-        </w:rPr>
-        <w:t>Toolbar butonu: 24px ikon üstte, 11px etiket altta. Etiket maksimum 8 karakter.</w:t>
+      <w:proofErr w:type="spellStart"/>
+      <w:r>
+        <w:rPr>
+          <w:color w:val="475569"/>
+        </w:rPr>
+        <w:t>Toolbar</w:t>
+      </w:r>
+      <w:proofErr w:type="spellEnd"/>
+      <w:r>
+        <w:rPr>
+          <w:color w:val="475569"/>
+        </w:rPr>
+        <w:t xml:space="preserve"> butonu: 24px ikon üstte, 11px etiket altta. Etiket maksimum 8 karakter.</w:t>
       </w:r>
     </w:p>
     <w:p>
@@ -5262,21 +6355,41 @@
       <w:pPr>
         <w:pStyle w:val="Balk3"/>
       </w:pPr>
-      <w:r>
-        <w:t>6.3  Toolbar içerik önerileri</w:t>
+      <w:proofErr w:type="gramStart"/>
+      <w:r>
+        <w:t xml:space="preserve">6.3  </w:t>
+      </w:r>
+      <w:proofErr w:type="spellStart"/>
+      <w:r>
+        <w:t>Toolbar</w:t>
+      </w:r>
+      <w:proofErr w:type="spellEnd"/>
+      <w:proofErr w:type="gramEnd"/>
+      <w:r>
+        <w:t xml:space="preserve"> içerik önerileri</w:t>
       </w:r>
     </w:p>
     <w:p>
       <w:pPr>
         <w:spacing w:before="60" w:after="40"/>
       </w:pPr>
+      <w:proofErr w:type="spellStart"/>
       <w:r>
         <w:rPr>
           <w:b/>
           <w:bCs/>
           <w:color w:val="0F172A"/>
         </w:rPr>
-        <w:t>Arkaplan seçiliyken:</w:t>
+        <w:t>Arkaplan</w:t>
+      </w:r>
+      <w:proofErr w:type="spellEnd"/>
+      <w:r>
+        <w:rPr>
+          <w:b/>
+          <w:bCs/>
+          <w:color w:val="0F172A"/>
+        </w:rPr>
+        <w:t xml:space="preserve"> seçiliyken:</w:t>
       </w:r>
     </w:p>
     <w:p>
@@ -5288,11 +6401,47 @@
         </w:numPr>
         <w:spacing w:before="40" w:after="40"/>
       </w:pPr>
-      <w:r>
-        <w:rPr>
-          <w:color w:val="0F172A"/>
-        </w:rPr>
-        <w:t>Görsel  |  Renk  |  Saydamlık  |  Köşeler</w:t>
+      <w:proofErr w:type="gramStart"/>
+      <w:r>
+        <w:rPr>
+          <w:color w:val="0F172A"/>
+        </w:rPr>
+        <w:t>Görsel  |</w:t>
+      </w:r>
+      <w:proofErr w:type="gramEnd"/>
+      <w:r>
+        <w:rPr>
+          <w:color w:val="0F172A"/>
+        </w:rPr>
+        <w:t xml:space="preserve">  </w:t>
+      </w:r>
+      <w:proofErr w:type="gramStart"/>
+      <w:r>
+        <w:rPr>
+          <w:color w:val="0F172A"/>
+        </w:rPr>
+        <w:t>Renk  |</w:t>
+      </w:r>
+      <w:proofErr w:type="gramEnd"/>
+      <w:r>
+        <w:rPr>
+          <w:color w:val="0F172A"/>
+        </w:rPr>
+        <w:t xml:space="preserve">  </w:t>
+      </w:r>
+      <w:proofErr w:type="gramStart"/>
+      <w:r>
+        <w:rPr>
+          <w:color w:val="0F172A"/>
+        </w:rPr>
+        <w:t>Saydamlık  |</w:t>
+      </w:r>
+      <w:proofErr w:type="gramEnd"/>
+      <w:r>
+        <w:rPr>
+          <w:color w:val="0F172A"/>
+        </w:rPr>
+        <w:t xml:space="preserve">  Köşeler</w:t>
       </w:r>
     </w:p>
     <w:p>
@@ -5317,11 +6466,61 @@
         </w:numPr>
         <w:spacing w:before="40" w:after="40"/>
       </w:pPr>
-      <w:r>
-        <w:rPr>
-          <w:color w:val="0F172A"/>
-        </w:rPr>
-        <w:t>Görsel  |  Yazı  |  Fiyat  |  Çerçeve  |  Kopyala</w:t>
+      <w:proofErr w:type="gramStart"/>
+      <w:r>
+        <w:rPr>
+          <w:color w:val="0F172A"/>
+        </w:rPr>
+        <w:t>Görsel  |</w:t>
+      </w:r>
+      <w:proofErr w:type="gramEnd"/>
+      <w:r>
+        <w:rPr>
+          <w:color w:val="0F172A"/>
+        </w:rPr>
+        <w:t xml:space="preserve">  </w:t>
+      </w:r>
+      <w:proofErr w:type="gramStart"/>
+      <w:r>
+        <w:rPr>
+          <w:color w:val="0F172A"/>
+        </w:rPr>
+        <w:t>Yazı  |</w:t>
+      </w:r>
+      <w:proofErr w:type="gramEnd"/>
+      <w:r>
+        <w:rPr>
+          <w:color w:val="0F172A"/>
+        </w:rPr>
+        <w:t xml:space="preserve">  </w:t>
+      </w:r>
+      <w:proofErr w:type="gramStart"/>
+      <w:r>
+        <w:rPr>
+          <w:color w:val="0F172A"/>
+        </w:rPr>
+        <w:t>Fiyat  |</w:t>
+      </w:r>
+      <w:proofErr w:type="gramEnd"/>
+      <w:r>
+        <w:rPr>
+          <w:color w:val="0F172A"/>
+        </w:rPr>
+        <w:t xml:space="preserve">  </w:t>
+      </w:r>
+      <w:proofErr w:type="gramStart"/>
+      <w:r>
+        <w:rPr>
+          <w:color w:val="0F172A"/>
+        </w:rPr>
+        <w:t>Çerçeve  |</w:t>
+      </w:r>
+      <w:proofErr w:type="gramEnd"/>
+      <w:r>
+        <w:rPr>
+          <w:color w:val="0F172A"/>
+        </w:rPr>
+        <w:t xml:space="preserve">  Kopyala</w:t>
       </w:r>
     </w:p>
     <w:p>
@@ -5350,7 +6549,49 @@
         <w:rPr>
           <w:color w:val="0F172A"/>
         </w:rPr>
-        <w:t>Geri al  |  Yinele  |  Izgara  |  Tüm sayfalara uygula</w:t>
+        <w:t xml:space="preserve">Geri </w:t>
+      </w:r>
+      <w:proofErr w:type="gramStart"/>
+      <w:r>
+        <w:rPr>
+          <w:color w:val="0F172A"/>
+        </w:rPr>
+        <w:t>al  |</w:t>
+      </w:r>
+      <w:proofErr w:type="gramEnd"/>
+      <w:r>
+        <w:rPr>
+          <w:color w:val="0F172A"/>
+        </w:rPr>
+        <w:t xml:space="preserve">  </w:t>
+      </w:r>
+      <w:proofErr w:type="gramStart"/>
+      <w:r>
+        <w:rPr>
+          <w:color w:val="0F172A"/>
+        </w:rPr>
+        <w:t>Yinele  |</w:t>
+      </w:r>
+      <w:proofErr w:type="gramEnd"/>
+      <w:r>
+        <w:rPr>
+          <w:color w:val="0F172A"/>
+        </w:rPr>
+        <w:t xml:space="preserve">  </w:t>
+      </w:r>
+      <w:proofErr w:type="gramStart"/>
+      <w:r>
+        <w:rPr>
+          <w:color w:val="0F172A"/>
+        </w:rPr>
+        <w:t>Izgara  |</w:t>
+      </w:r>
+      <w:proofErr w:type="gramEnd"/>
+      <w:r>
+        <w:rPr>
+          <w:color w:val="0F172A"/>
+        </w:rPr>
+        <w:t xml:space="preserve">  Tüm sayfalara uygula</w:t>
       </w:r>
     </w:p>
     <w:p>
@@ -5362,8 +6603,13 @@
       <w:pPr>
         <w:pStyle w:val="Balk3"/>
       </w:pPr>
-      <w:r>
-        <w:t>6.4  Sağ panel akordiyonları</w:t>
+      <w:proofErr w:type="gramStart"/>
+      <w:r>
+        <w:t>6.4  Sağ</w:t>
+      </w:r>
+      <w:proofErr w:type="gramEnd"/>
+      <w:r>
+        <w:t xml:space="preserve"> panel akordiyonları</w:t>
       </w:r>
     </w:p>
     <w:p>
@@ -5435,7 +6681,63 @@
         <w:rPr>
           <w:color w:val="475569"/>
         </w:rPr>
-        <w:t>18px ikon + 13px medium etiket + chevron ikonu sağda. Tüm başlıklar sentence case.</w:t>
+        <w:t xml:space="preserve">18px ikon + 13px </w:t>
+      </w:r>
+      <w:proofErr w:type="spellStart"/>
+      <w:r>
+        <w:rPr>
+          <w:color w:val="475569"/>
+        </w:rPr>
+        <w:t>medium</w:t>
+      </w:r>
+      <w:proofErr w:type="spellEnd"/>
+      <w:r>
+        <w:rPr>
+          <w:color w:val="475569"/>
+        </w:rPr>
+        <w:t xml:space="preserve"> etiket + </w:t>
+      </w:r>
+      <w:proofErr w:type="spellStart"/>
+      <w:r>
+        <w:rPr>
+          <w:color w:val="475569"/>
+        </w:rPr>
+        <w:t>chevron</w:t>
+      </w:r>
+      <w:proofErr w:type="spellEnd"/>
+      <w:r>
+        <w:rPr>
+          <w:color w:val="475569"/>
+        </w:rPr>
+        <w:t xml:space="preserve"> ikonu sağda. Tüm başlıklar </w:t>
+      </w:r>
+      <w:proofErr w:type="spellStart"/>
+      <w:r>
+        <w:rPr>
+          <w:color w:val="475569"/>
+        </w:rPr>
+        <w:t>sentence</w:t>
+      </w:r>
+      <w:proofErr w:type="spellEnd"/>
+      <w:r>
+        <w:rPr>
+          <w:color w:val="475569"/>
+        </w:rPr>
+        <w:t xml:space="preserve"> </w:t>
+      </w:r>
+      <w:proofErr w:type="spellStart"/>
+      <w:r>
+        <w:rPr>
+          <w:color w:val="475569"/>
+        </w:rPr>
+        <w:t>case</w:t>
+      </w:r>
+      <w:proofErr w:type="spellEnd"/>
+      <w:r>
+        <w:rPr>
+          <w:color w:val="475569"/>
+        </w:rPr>
+        <w:t>.</w:t>
       </w:r>
     </w:p>
     <w:p>
@@ -5467,27 +6769,27 @@
         <w:spacing w:before="80"/>
       </w:pPr>
     </w:p>
-    <w:p>
-      <w:pPr>
-        <w:pBdr>
-          <w:left w:val="single" w:sz="12" w:space="0" w:color="D97706"/>
-        </w:pBdr>
-        <w:shd w:val="clear" w:color="auto" w:fill="FFFBEB"/>
-        <w:spacing w:before="120" w:after="120"/>
-        <w:ind w:left="240"/>
-      </w:pPr>
-      <w:r>
-        <w:rPr>
-          <w:i/>
-          <w:iCs/>
-          <w:color w:val="0F172A"/>
-          <w:sz w:val="20"/>
-          <w:szCs w:val="20"/>
-        </w:rPr>
-        <w:t>Geliştirme aşamasındaki özellikler panelde görünmemeli. 'Yakında eklenecek' veya 'geliştirme aşamasında' gibi notlar kullanıcıyı hayal kırıklığına uğratır.</w:t>
-      </w:r>
-    </w:p>
-    <w:p>
+    <w:p/>
+    <w:p>
+      <w:r>
+        <w:t xml:space="preserve">Henüz </w:t>
+      </w:r>
+      <w:proofErr w:type="spellStart"/>
+      <w:r>
+        <w:t>backend</w:t>
+      </w:r>
+      <w:proofErr w:type="spellEnd"/>
+      <w:r>
+        <w:t xml:space="preserve"> bağlantısı olmayan özellikler gizlenmez, pasif (</w:t>
+      </w:r>
+      <w:proofErr w:type="spellStart"/>
+      <w:r>
+        <w:t>disabled</w:t>
+      </w:r>
+      <w:proofErr w:type="spellEnd"/>
+      <w:r>
+        <w:t>) görünümde iskelet olarak kalır. Canlıya alındığında aktifleştirilir.</w:t>
+      </w:r>
       <w:r>
         <w:br w:type="page"/>
       </w:r>
@@ -5505,8 +6807,13 @@
       <w:pPr>
         <w:pStyle w:val="Balk3"/>
       </w:pPr>
-      <w:r>
-        <w:t>7.1  Aktif sekme tasarımı</w:t>
+      <w:proofErr w:type="gramStart"/>
+      <w:r>
+        <w:t>7.1  Aktif</w:t>
+      </w:r>
+      <w:proofErr w:type="gramEnd"/>
+      <w:r>
+        <w:t xml:space="preserve"> sekme tasarımı</w:t>
       </w:r>
     </w:p>
     <w:p>
@@ -5541,7 +6848,21 @@
         <w:rPr>
           <w:color w:val="475569"/>
         </w:rPr>
-        <w:t>2px, primary (#1a56db). Evrensel ‘aktif sekme’ konvansiyonu.</w:t>
+        <w:t xml:space="preserve">2px, </w:t>
+      </w:r>
+      <w:proofErr w:type="spellStart"/>
+      <w:r>
+        <w:rPr>
+          <w:color w:val="475569"/>
+        </w:rPr>
+        <w:t>primary</w:t>
+      </w:r>
+      <w:proofErr w:type="spellEnd"/>
+      <w:r>
+        <w:rPr>
+          <w:color w:val="475569"/>
+        </w:rPr>
+        <w:t xml:space="preserve"> (#1a56db). Evrensel ‘aktif sekme’ konvansiyonu.</w:t>
       </w:r>
     </w:p>
     <w:p>
@@ -5561,11 +6882,19 @@
         </w:rPr>
         <w:t xml:space="preserve">Arka plan — </w:t>
       </w:r>
-      <w:r>
-        <w:rPr>
-          <w:color w:val="475569"/>
-        </w:rPr>
-        <w:t>surface-panel (#ffffff). Aktif sekme hafif zemin olmadan yalnızca alt çizgiyle belirtilir.</w:t>
+      <w:proofErr w:type="spellStart"/>
+      <w:r>
+        <w:rPr>
+          <w:color w:val="475569"/>
+        </w:rPr>
+        <w:t>surface</w:t>
+      </w:r>
+      <w:proofErr w:type="spellEnd"/>
+      <w:r>
+        <w:rPr>
+          <w:color w:val="475569"/>
+        </w:rPr>
+        <w:t>-panel (#ffffff). Aktif sekme hafif zemin olmadan yalnızca alt çizgiyle belirtilir.</w:t>
       </w:r>
     </w:p>
     <w:p>
@@ -5585,11 +6914,33 @@
         </w:rPr>
         <w:t xml:space="preserve">İkon ve etiket rengi — </w:t>
       </w:r>
-      <w:r>
-        <w:rPr>
-          <w:color w:val="475569"/>
-        </w:rPr>
-        <w:t>text-primary (#0f172a) aktif sekmede, text-secondary (#475569) pasif sekmede.</w:t>
+      <w:proofErr w:type="spellStart"/>
+      <w:r>
+        <w:rPr>
+          <w:color w:val="475569"/>
+        </w:rPr>
+        <w:t>text-primary</w:t>
+      </w:r>
+      <w:proofErr w:type="spellEnd"/>
+      <w:r>
+        <w:rPr>
+          <w:color w:val="475569"/>
+        </w:rPr>
+        <w:t xml:space="preserve"> (#0f172a) aktif sekmede, </w:t>
+      </w:r>
+      <w:proofErr w:type="spellStart"/>
+      <w:r>
+        <w:rPr>
+          <w:color w:val="475569"/>
+        </w:rPr>
+        <w:t>text-secondary</w:t>
+      </w:r>
+      <w:proofErr w:type="spellEnd"/>
+      <w:r>
+        <w:rPr>
+          <w:color w:val="475569"/>
+        </w:rPr>
+        <w:t xml:space="preserve"> (#475569) pasif sekmede.</w:t>
       </w:r>
     </w:p>
     <w:p>
@@ -5614,7 +6965,51 @@
           <w:sz w:val="20"/>
           <w:szCs w:val="20"/>
         </w:rPr>
-        <w:t>Aktif sekme primary (#1a56db) alt çizgi ile belirtilir. Zemin surface-panel (#ffffff) kalır — fazladan mavi zemin aksiyon rengiyle karışıklık yaratır.</w:t>
+        <w:t xml:space="preserve">Aktif sekme </w:t>
+      </w:r>
+      <w:proofErr w:type="spellStart"/>
+      <w:r>
+        <w:rPr>
+          <w:i/>
+          <w:iCs/>
+          <w:color w:val="0F172A"/>
+          <w:sz w:val="20"/>
+          <w:szCs w:val="20"/>
+        </w:rPr>
+        <w:t>primary</w:t>
+      </w:r>
+      <w:proofErr w:type="spellEnd"/>
+      <w:r>
+        <w:rPr>
+          <w:i/>
+          <w:iCs/>
+          <w:color w:val="0F172A"/>
+          <w:sz w:val="20"/>
+          <w:szCs w:val="20"/>
+        </w:rPr>
+        <w:t xml:space="preserve"> (#1a56db) alt çizgi ile belirtilir. Zemin </w:t>
+      </w:r>
+      <w:proofErr w:type="spellStart"/>
+      <w:r>
+        <w:rPr>
+          <w:i/>
+          <w:iCs/>
+          <w:color w:val="0F172A"/>
+          <w:sz w:val="20"/>
+          <w:szCs w:val="20"/>
+        </w:rPr>
+        <w:t>surface</w:t>
+      </w:r>
+      <w:proofErr w:type="spellEnd"/>
+      <w:r>
+        <w:rPr>
+          <w:i/>
+          <w:iCs/>
+          <w:color w:val="0F172A"/>
+          <w:sz w:val="20"/>
+          <w:szCs w:val="20"/>
+        </w:rPr>
+        <w:t>-panel (#ffffff) kalır — fazladan mavi zemin aksiyon rengiyle karışıklık yaratır.</w:t>
       </w:r>
     </w:p>
     <w:p>
@@ -5626,8 +7021,13 @@
       <w:pPr>
         <w:pStyle w:val="Balk3"/>
       </w:pPr>
-      <w:r>
-        <w:t>7.2  Sekme etiket ve ikon önerileri</w:t>
+      <w:proofErr w:type="gramStart"/>
+      <w:r>
+        <w:t>7.2  Sekme</w:t>
+      </w:r>
+      <w:proofErr w:type="gramEnd"/>
+      <w:r>
+        <w:t xml:space="preserve"> etiket ve ikon önerileri</w:t>
       </w:r>
     </w:p>
     <w:p>
@@ -5740,6 +7140,7 @@
             </w:tcMar>
           </w:tcPr>
           <w:p>
+            <w:proofErr w:type="spellStart"/>
             <w:r>
               <w:rPr>
                 <w:b/>
@@ -5748,28 +7149,9 @@
                 <w:sz w:val="20"/>
                 <w:szCs w:val="20"/>
               </w:rPr>
-              <w:t>Lucide ikonu</w:t>
-            </w:r>
-          </w:p>
-        </w:tc>
-        <w:tc>
-          <w:tcPr>
-            <w:tcW w:w="3373" w:type="dxa"/>
-            <w:tcBorders>
-              <w:top w:val="single" w:sz="4" w:space="0" w:color="E2E8F0"/>
-              <w:left w:val="single" w:sz="4" w:space="0" w:color="E2E8F0"/>
-              <w:bottom w:val="single" w:sz="4" w:space="0" w:color="E2E8F0"/>
-              <w:right w:val="single" w:sz="4" w:space="0" w:color="E2E8F0"/>
-            </w:tcBorders>
-            <w:shd w:val="clear" w:color="auto" w:fill="0F172A"/>
-            <w:tcMar>
-              <w:top w:w="80" w:type="dxa"/>
-              <w:left w:w="120" w:type="dxa"/>
-              <w:bottom w:w="80" w:type="dxa"/>
-              <w:right w:w="120" w:type="dxa"/>
-            </w:tcMar>
-          </w:tcPr>
-          <w:p>
+              <w:t>Lucide</w:t>
+            </w:r>
+            <w:proofErr w:type="spellEnd"/>
             <w:r>
               <w:rPr>
                 <w:b/>
@@ -5778,6 +7160,36 @@
                 <w:sz w:val="20"/>
                 <w:szCs w:val="20"/>
               </w:rPr>
+              <w:t xml:space="preserve"> ikonu</w:t>
+            </w:r>
+          </w:p>
+        </w:tc>
+        <w:tc>
+          <w:tcPr>
+            <w:tcW w:w="3373" w:type="dxa"/>
+            <w:tcBorders>
+              <w:top w:val="single" w:sz="4" w:space="0" w:color="E2E8F0"/>
+              <w:left w:val="single" w:sz="4" w:space="0" w:color="E2E8F0"/>
+              <w:bottom w:val="single" w:sz="4" w:space="0" w:color="E2E8F0"/>
+              <w:right w:val="single" w:sz="4" w:space="0" w:color="E2E8F0"/>
+            </w:tcBorders>
+            <w:shd w:val="clear" w:color="auto" w:fill="0F172A"/>
+            <w:tcMar>
+              <w:top w:w="80" w:type="dxa"/>
+              <w:left w:w="120" w:type="dxa"/>
+              <w:bottom w:w="80" w:type="dxa"/>
+              <w:right w:w="120" w:type="dxa"/>
+            </w:tcMar>
+          </w:tcPr>
+          <w:p>
+            <w:r>
+              <w:rPr>
+                <w:b/>
+                <w:bCs/>
+                <w:color w:val="FFFFFF"/>
+                <w:sz w:val="20"/>
+                <w:szCs w:val="20"/>
+              </w:rPr>
               <w:t>Alt etiket (opsiyonel)</w:t>
             </w:r>
           </w:p>
@@ -5861,6 +7273,7 @@
             </w:tcMar>
           </w:tcPr>
           <w:p>
+            <w:proofErr w:type="spellStart"/>
             <w:r>
               <w:rPr>
                 <w:rFonts w:ascii="Courier New" w:eastAsia="Courier New" w:hAnsi="Courier New" w:cs="Courier New"/>
@@ -5870,6 +7283,7 @@
               </w:rPr>
               <w:t>PackageOpen</w:t>
             </w:r>
+            <w:proofErr w:type="spellEnd"/>
           </w:p>
         </w:tc>
         <w:tc>
@@ -6095,6 +7509,7 @@
             </w:tcMar>
           </w:tcPr>
           <w:p>
+            <w:proofErr w:type="spellStart"/>
             <w:r>
               <w:rPr>
                 <w:rFonts w:ascii="Courier New" w:eastAsia="Courier New" w:hAnsi="Courier New" w:cs="Courier New"/>
@@ -6104,6 +7519,7 @@
               </w:rPr>
               <w:t>LayoutGrid</w:t>
             </w:r>
+            <w:proofErr w:type="spellEnd"/>
           </w:p>
         </w:tc>
         <w:tc>
@@ -6212,6 +7628,7 @@
             </w:tcMar>
           </w:tcPr>
           <w:p>
+            <w:proofErr w:type="spellStart"/>
             <w:r>
               <w:rPr>
                 <w:rFonts w:ascii="Courier New" w:eastAsia="Courier New" w:hAnsi="Courier New" w:cs="Courier New"/>
@@ -6221,6 +7638,7 @@
               </w:rPr>
               <w:t>Layers</w:t>
             </w:r>
+            <w:proofErr w:type="spellEnd"/>
           </w:p>
         </w:tc>
         <w:tc>
@@ -7043,6 +8461,7 @@
             </w:tcMar>
           </w:tcPr>
           <w:p>
+            <w:proofErr w:type="spellStart"/>
             <w:r>
               <w:rPr>
                 <w:strike/>
@@ -7050,7 +8469,17 @@
                 <w:sz w:val="20"/>
                 <w:szCs w:val="20"/>
               </w:rPr>
-              <w:t>Kısurat %</w:t>
+              <w:t>Kısurat</w:t>
+            </w:r>
+            <w:proofErr w:type="spellEnd"/>
+            <w:r>
+              <w:rPr>
+                <w:strike/>
+                <w:color w:val="DC2626"/>
+                <w:sz w:val="20"/>
+                <w:szCs w:val="20"/>
+              </w:rPr>
+              <w:t xml:space="preserve"> %</w:t>
             </w:r>
           </w:p>
         </w:tc>
@@ -7122,8 +8551,13 @@
       <w:pPr>
         <w:pStyle w:val="Balk3"/>
       </w:pPr>
-      <w:r>
-        <w:t>8.1  Genel dil kuralları</w:t>
+      <w:proofErr w:type="gramStart"/>
+      <w:r>
+        <w:t>8.1  Genel</w:t>
+      </w:r>
+      <w:proofErr w:type="gramEnd"/>
+      <w:r>
+        <w:t xml:space="preserve"> dil kuralları</w:t>
       </w:r>
     </w:p>
     <w:p>
@@ -7147,7 +8581,21 @@
         <w:rPr>
           <w:color w:val="475569"/>
         </w:rPr>
-        <w:t>İngilizce teknik terim yerine Türkçe karşılığı varsa kullan. 'Upload' değil 'Yükle'.</w:t>
+        <w:t>İngilizce teknik terim yerine Türkçe karşılığı varsa kullan. '</w:t>
+      </w:r>
+      <w:proofErr w:type="spellStart"/>
+      <w:r>
+        <w:rPr>
+          <w:color w:val="475569"/>
+        </w:rPr>
+        <w:t>Upload</w:t>
+      </w:r>
+      <w:proofErr w:type="spellEnd"/>
+      <w:r>
+        <w:rPr>
+          <w:color w:val="475569"/>
+        </w:rPr>
+        <w:t>' değil 'Yükle'.</w:t>
       </w:r>
     </w:p>
     <w:p>
@@ -7183,13 +8631,41 @@
         </w:numPr>
         <w:spacing w:before="40" w:after="40"/>
       </w:pPr>
+      <w:proofErr w:type="spellStart"/>
       <w:r>
         <w:rPr>
           <w:b/>
           <w:bCs/>
           <w:color w:val="0F172A"/>
         </w:rPr>
-        <w:t xml:space="preserve">Sentence case zorunlu — </w:t>
+        <w:t>Sentence</w:t>
+      </w:r>
+      <w:proofErr w:type="spellEnd"/>
+      <w:r>
+        <w:rPr>
+          <w:b/>
+          <w:bCs/>
+          <w:color w:val="0F172A"/>
+        </w:rPr>
+        <w:t xml:space="preserve"> </w:t>
+      </w:r>
+      <w:proofErr w:type="spellStart"/>
+      <w:r>
+        <w:rPr>
+          <w:b/>
+          <w:bCs/>
+          <w:color w:val="0F172A"/>
+        </w:rPr>
+        <w:t>case</w:t>
+      </w:r>
+      <w:proofErr w:type="spellEnd"/>
+      <w:r>
+        <w:rPr>
+          <w:b/>
+          <w:bCs/>
+          <w:color w:val="0F172A"/>
+        </w:rPr>
+        <w:t xml:space="preserve"> zorunlu — </w:t>
       </w:r>
       <w:r>
         <w:rPr>
@@ -7264,8 +8740,13 @@
       <w:pPr>
         <w:pStyle w:val="Balk3"/>
       </w:pPr>
-      <w:r>
-        <w:t>9.1  Geri alınamaz aksiyonlar</w:t>
+      <w:proofErr w:type="gramStart"/>
+      <w:r>
+        <w:t>9.1  Geri</w:t>
+      </w:r>
+      <w:proofErr w:type="gramEnd"/>
+      <w:r>
+        <w:t xml:space="preserve"> alınamaz aksiyonlar</w:t>
       </w:r>
     </w:p>
     <w:p>
@@ -7285,7 +8766,29 @@
           <w:sz w:val="20"/>
           <w:szCs w:val="20"/>
         </w:rPr>
-        <w:t>Kural: Geri alınamaz her aksiyon, tıklandığında onay modalı açmalıdır. Onaysız silme veya temizleme işlemi kesinlikle yapılmaz.</w:t>
+        <w:t xml:space="preserve">Kural: Geri alınamaz her aksiyon, tıklandığında onay </w:t>
+      </w:r>
+      <w:proofErr w:type="spellStart"/>
+      <w:r>
+        <w:rPr>
+          <w:i/>
+          <w:iCs/>
+          <w:color w:val="0F172A"/>
+          <w:sz w:val="20"/>
+          <w:szCs w:val="20"/>
+        </w:rPr>
+        <w:t>modalı</w:t>
+      </w:r>
+      <w:proofErr w:type="spellEnd"/>
+      <w:r>
+        <w:rPr>
+          <w:i/>
+          <w:iCs/>
+          <w:color w:val="0F172A"/>
+          <w:sz w:val="20"/>
+          <w:szCs w:val="20"/>
+        </w:rPr>
+        <w:t xml:space="preserve"> açmalıdır. Onaysız silme veya temizleme işlemi kesinlikle yapılmaz.</w:t>
       </w:r>
     </w:p>
     <w:p>
@@ -7356,13 +8859,59 @@
           <w:bCs/>
           <w:color w:val="0F172A"/>
         </w:rPr>
-        <w:t xml:space="preserve">Geri al (Undo) — </w:t>
-      </w:r>
-      <w:r>
-        <w:rPr>
-          <w:color w:val="475569"/>
-        </w:rPr>
-        <w:t>Mümkün olan her aksiyonda Ctrl+Z çalışmalı. Geri al butonu üst toolbar'da belirgin olmalı.</w:t>
+        <w:t>Geri al (</w:t>
+      </w:r>
+      <w:proofErr w:type="spellStart"/>
+      <w:r>
+        <w:rPr>
+          <w:b/>
+          <w:bCs/>
+          <w:color w:val="0F172A"/>
+        </w:rPr>
+        <w:t>Undo</w:t>
+      </w:r>
+      <w:proofErr w:type="spellEnd"/>
+      <w:r>
+        <w:rPr>
+          <w:b/>
+          <w:bCs/>
+          <w:color w:val="0F172A"/>
+        </w:rPr>
+        <w:t xml:space="preserve">) — </w:t>
+      </w:r>
+      <w:r>
+        <w:rPr>
+          <w:color w:val="475569"/>
+        </w:rPr>
+        <w:t xml:space="preserve">Mümkün olan her aksiyonda </w:t>
+      </w:r>
+      <w:proofErr w:type="spellStart"/>
+      <w:r>
+        <w:rPr>
+          <w:color w:val="475569"/>
+        </w:rPr>
+        <w:t>Ctrl+Z</w:t>
+      </w:r>
+      <w:proofErr w:type="spellEnd"/>
+      <w:r>
+        <w:rPr>
+          <w:color w:val="475569"/>
+        </w:rPr>
+        <w:t xml:space="preserve"> çalışmalı. Geri al butonu üst </w:t>
+      </w:r>
+      <w:proofErr w:type="spellStart"/>
+      <w:r>
+        <w:rPr>
+          <w:color w:val="475569"/>
+        </w:rPr>
+        <w:t>toolbar'da</w:t>
+      </w:r>
+      <w:proofErr w:type="spellEnd"/>
+      <w:r>
+        <w:rPr>
+          <w:color w:val="475569"/>
+        </w:rPr>
+        <w:t xml:space="preserve"> belirgin olmalı.</w:t>
       </w:r>
     </w:p>
     <w:p>
@@ -7374,8 +8923,13 @@
       <w:pPr>
         <w:pStyle w:val="Balk3"/>
       </w:pPr>
-      <w:r>
-        <w:t>9.2  Boş durum tasarımı</w:t>
+      <w:proofErr w:type="gramStart"/>
+      <w:r>
+        <w:t>9.2  Boş</w:t>
+      </w:r>
+      <w:proofErr w:type="gramEnd"/>
+      <w:r>
+        <w:t xml:space="preserve"> durum tasarımı</w:t>
       </w:r>
     </w:p>
     <w:p>
@@ -7459,8 +9013,13 @@
       <w:pPr>
         <w:pStyle w:val="Balk3"/>
       </w:pPr>
-      <w:r>
-        <w:t>9.3  Devre dışı durum</w:t>
+      <w:proofErr w:type="gramStart"/>
+      <w:r>
+        <w:t>9.3  Devre</w:t>
+      </w:r>
+      <w:proofErr w:type="gramEnd"/>
+      <w:r>
+        <w:t xml:space="preserve"> dışı durum</w:t>
       </w:r>
     </w:p>
     <w:p>
@@ -7484,7 +9043,49 @@
         <w:rPr>
           <w:color w:val="475569"/>
         </w:rPr>
-        <w:t>%40 opaklık. Cursor: not-allowed. Arka plan: surface-subtle (#f8fafc).</w:t>
+        <w:t xml:space="preserve">%40 opaklık. </w:t>
+      </w:r>
+      <w:proofErr w:type="spellStart"/>
+      <w:r>
+        <w:rPr>
+          <w:color w:val="475569"/>
+        </w:rPr>
+        <w:t>Cursor</w:t>
+      </w:r>
+      <w:proofErr w:type="spellEnd"/>
+      <w:r>
+        <w:rPr>
+          <w:color w:val="475569"/>
+        </w:rPr>
+        <w:t>: not-</w:t>
+      </w:r>
+      <w:proofErr w:type="spellStart"/>
+      <w:r>
+        <w:rPr>
+          <w:color w:val="475569"/>
+        </w:rPr>
+        <w:t>allowed</w:t>
+      </w:r>
+      <w:proofErr w:type="spellEnd"/>
+      <w:r>
+        <w:rPr>
+          <w:color w:val="475569"/>
+        </w:rPr>
+        <w:t xml:space="preserve">. Arka plan: </w:t>
+      </w:r>
+      <w:proofErr w:type="spellStart"/>
+      <w:r>
+        <w:rPr>
+          <w:color w:val="475569"/>
+        </w:rPr>
+        <w:t>surface-subtle</w:t>
+      </w:r>
+      <w:proofErr w:type="spellEnd"/>
+      <w:r>
+        <w:rPr>
+          <w:color w:val="475569"/>
+        </w:rPr>
+        <w:t xml:space="preserve"> (#f8fafc).</w:t>
       </w:r>
     </w:p>
     <w:p>
@@ -7496,19 +9097,43 @@
         </w:numPr>
         <w:spacing w:before="40" w:after="40"/>
       </w:pPr>
+      <w:proofErr w:type="spellStart"/>
       <w:r>
         <w:rPr>
           <w:b/>
           <w:bCs/>
           <w:color w:val="0F172A"/>
         </w:rPr>
-        <w:t xml:space="preserve">Tooltip zorunlu — </w:t>
-      </w:r>
-      <w:r>
-        <w:rPr>
-          <w:color w:val="475569"/>
-        </w:rPr>
-        <w:t>Devre dışı elemana hover'da neden devre dışı olduğu açıklanır. 'Önce ürün listeni yükle' gibi.</w:t>
+        <w:t>Tooltip</w:t>
+      </w:r>
+      <w:proofErr w:type="spellEnd"/>
+      <w:r>
+        <w:rPr>
+          <w:b/>
+          <w:bCs/>
+          <w:color w:val="0F172A"/>
+        </w:rPr>
+        <w:t xml:space="preserve"> zorunlu — </w:t>
+      </w:r>
+      <w:r>
+        <w:rPr>
+          <w:color w:val="475569"/>
+        </w:rPr>
+        <w:t xml:space="preserve">Devre dışı elemana </w:t>
+      </w:r>
+      <w:proofErr w:type="spellStart"/>
+      <w:r>
+        <w:rPr>
+          <w:color w:val="475569"/>
+        </w:rPr>
+        <w:t>hover'da</w:t>
+      </w:r>
+      <w:proofErr w:type="spellEnd"/>
+      <w:r>
+        <w:rPr>
+          <w:color w:val="475569"/>
+        </w:rPr>
+        <w:t xml:space="preserve"> neden devre dışı olduğu açıklanır. 'Önce ürün listeni yükle' gibi.</w:t>
       </w:r>
     </w:p>
     <w:p>
@@ -7557,7 +9182,29 @@
           <w:sz w:val="20"/>
           <w:szCs w:val="20"/>
         </w:rPr>
-        <w:t>Acemi kullanıcı için en önemli güvence: her yanlış tıklamanın geri alınabilir olduğunu bilmek. Undo her zaman çalışmalı.</w:t>
+        <w:t xml:space="preserve">Acemi kullanıcı için en önemli güvence: her yanlış tıklamanın geri alınabilir olduğunu bilmek. </w:t>
+      </w:r>
+      <w:proofErr w:type="spellStart"/>
+      <w:r>
+        <w:rPr>
+          <w:i/>
+          <w:iCs/>
+          <w:color w:val="0F172A"/>
+          <w:sz w:val="20"/>
+          <w:szCs w:val="20"/>
+        </w:rPr>
+        <w:t>Undo</w:t>
+      </w:r>
+      <w:proofErr w:type="spellEnd"/>
+      <w:r>
+        <w:rPr>
+          <w:i/>
+          <w:iCs/>
+          <w:color w:val="0F172A"/>
+          <w:sz w:val="20"/>
+          <w:szCs w:val="20"/>
+        </w:rPr>
+        <w:t xml:space="preserve"> her zaman çalışmalı.</w:t>
       </w:r>
     </w:p>
     <w:p>
@@ -7611,7 +9258,35 @@
         <w:rPr>
           <w:color w:val="0F172A"/>
         </w:rPr>
-        <w:t>Tüm etiketler sentence case mi? (Büyük harf yok)</w:t>
+        <w:t xml:space="preserve">Tüm etiketler </w:t>
+      </w:r>
+      <w:proofErr w:type="spellStart"/>
+      <w:r>
+        <w:rPr>
+          <w:color w:val="0F172A"/>
+        </w:rPr>
+        <w:t>sentence</w:t>
+      </w:r>
+      <w:proofErr w:type="spellEnd"/>
+      <w:r>
+        <w:rPr>
+          <w:color w:val="0F172A"/>
+        </w:rPr>
+        <w:t xml:space="preserve"> </w:t>
+      </w:r>
+      <w:proofErr w:type="spellStart"/>
+      <w:r>
+        <w:rPr>
+          <w:color w:val="0F172A"/>
+        </w:rPr>
+        <w:t>case</w:t>
+      </w:r>
+      <w:proofErr w:type="spellEnd"/>
+      <w:r>
+        <w:rPr>
+          <w:color w:val="0F172A"/>
+        </w:rPr>
+        <w:t xml:space="preserve"> mi? (Büyük harf yok)</w:t>
       </w:r>
     </w:p>
     <w:p>
@@ -7736,7 +9411,21 @@
         <w:rPr>
           <w:color w:val="0F172A"/>
         </w:rPr>
-        <w:t>Metin kontrastı yeterli mi? (minimum 4.5:1)</w:t>
+        <w:t>Metin kontrastı yeterli mi? (</w:t>
+      </w:r>
+      <w:proofErr w:type="gramStart"/>
+      <w:r>
+        <w:rPr>
+          <w:color w:val="0F172A"/>
+        </w:rPr>
+        <w:t>minimum</w:t>
+      </w:r>
+      <w:proofErr w:type="gramEnd"/>
+      <w:r>
+        <w:rPr>
+          <w:color w:val="0F172A"/>
+        </w:rPr>
+        <w:t xml:space="preserve"> 4.5:1)</w:t>
       </w:r>
     </w:p>
     <w:p>
@@ -7781,7 +9470,35 @@
         <w:rPr>
           <w:color w:val="0F172A"/>
         </w:rPr>
-        <w:t>Tüm ikonlar Lucide React'tan mı?</w:t>
+        <w:t xml:space="preserve">Tüm ikonlar </w:t>
+      </w:r>
+      <w:proofErr w:type="spellStart"/>
+      <w:r>
+        <w:rPr>
+          <w:color w:val="0F172A"/>
+        </w:rPr>
+        <w:t>Lucide</w:t>
+      </w:r>
+      <w:proofErr w:type="spellEnd"/>
+      <w:r>
+        <w:rPr>
+          <w:color w:val="0F172A"/>
+        </w:rPr>
+        <w:t xml:space="preserve"> </w:t>
+      </w:r>
+      <w:proofErr w:type="spellStart"/>
+      <w:r>
+        <w:rPr>
+          <w:color w:val="0F172A"/>
+        </w:rPr>
+        <w:t>React'tan</w:t>
+      </w:r>
+      <w:proofErr w:type="spellEnd"/>
+      <w:r>
+        <w:rPr>
+          <w:color w:val="0F172A"/>
+        </w:rPr>
+        <w:t xml:space="preserve"> mı?</w:t>
       </w:r>
     </w:p>
     <w:p>
@@ -7797,7 +9514,37 @@
         <w:rPr>
           <w:color w:val="0F172A"/>
         </w:rPr>
-        <w:t>İkonlar outline stilinde mi? (filled yok)</w:t>
+        <w:t xml:space="preserve">İkonlar </w:t>
+      </w:r>
+      <w:proofErr w:type="spellStart"/>
+      <w:r>
+        <w:rPr>
+          <w:color w:val="0F172A"/>
+        </w:rPr>
+        <w:t>outline</w:t>
+      </w:r>
+      <w:proofErr w:type="spellEnd"/>
+      <w:r>
+        <w:rPr>
+          <w:color w:val="0F172A"/>
+        </w:rPr>
+        <w:t xml:space="preserve"> stilinde mi? (</w:t>
+      </w:r>
+      <w:proofErr w:type="spellStart"/>
+      <w:proofErr w:type="gramStart"/>
+      <w:r>
+        <w:rPr>
+          <w:color w:val="0F172A"/>
+        </w:rPr>
+        <w:t>filled</w:t>
+      </w:r>
+      <w:proofErr w:type="spellEnd"/>
+      <w:proofErr w:type="gramEnd"/>
+      <w:r>
+        <w:rPr>
+          <w:color w:val="0F172A"/>
+        </w:rPr>
+        <w:t xml:space="preserve"> yok)</w:t>
       </w:r>
     </w:p>
     <w:p>
@@ -7813,7 +9560,21 @@
         <w:rPr>
           <w:color w:val="0F172A"/>
         </w:rPr>
-        <w:t>Her ikonun yanında metin etiketi veya tooltip var mı?</w:t>
+        <w:t xml:space="preserve">Her ikonun yanında metin etiketi veya </w:t>
+      </w:r>
+      <w:proofErr w:type="spellStart"/>
+      <w:r>
+        <w:rPr>
+          <w:color w:val="0F172A"/>
+        </w:rPr>
+        <w:t>tooltip</w:t>
+      </w:r>
+      <w:proofErr w:type="spellEnd"/>
+      <w:r>
+        <w:rPr>
+          <w:color w:val="0F172A"/>
+        </w:rPr>
+        <w:t xml:space="preserve"> var mı?</w:t>
       </w:r>
     </w:p>
     <w:p>
@@ -7854,11 +9615,19 @@
         </w:numPr>
         <w:spacing w:before="40" w:after="40"/>
       </w:pPr>
-      <w:r>
-        <w:rPr>
-          <w:color w:val="0F172A"/>
-        </w:rPr>
-        <w:t>Toolbar'da maksimum 5-6 araç var mı?</w:t>
+      <w:proofErr w:type="spellStart"/>
+      <w:r>
+        <w:rPr>
+          <w:color w:val="0F172A"/>
+        </w:rPr>
+        <w:t>Toolbar'da</w:t>
+      </w:r>
+      <w:proofErr w:type="spellEnd"/>
+      <w:r>
+        <w:rPr>
+          <w:color w:val="0F172A"/>
+        </w:rPr>
+        <w:t xml:space="preserve"> maksimum 5-6 araç var mı?</w:t>
       </w:r>
     </w:p>
     <w:p>
@@ -7874,7 +9643,21 @@
         <w:rPr>
           <w:color w:val="0F172A"/>
         </w:rPr>
-        <w:t>Akordiyonlar doğru öncelik sırasında mı? (en çok kullanılan en üstte)</w:t>
+        <w:t>Akordiyonlar doğru öncelik sırasında mı? (</w:t>
+      </w:r>
+      <w:proofErr w:type="gramStart"/>
+      <w:r>
+        <w:rPr>
+          <w:color w:val="0F172A"/>
+        </w:rPr>
+        <w:t>en</w:t>
+      </w:r>
+      <w:proofErr w:type="gramEnd"/>
+      <w:r>
+        <w:rPr>
+          <w:color w:val="0F172A"/>
+        </w:rPr>
+        <w:t xml:space="preserve"> çok kullanılan en üstte)</w:t>
       </w:r>
     </w:p>
     <w:p>
@@ -7935,7 +9718,21 @@
         <w:rPr>
           <w:color w:val="0F172A"/>
         </w:rPr>
-        <w:t>Geri alınamaz her aksiyonda onay modalı var mı?</w:t>
+        <w:t xml:space="preserve">Geri alınamaz her aksiyonda onay </w:t>
+      </w:r>
+      <w:proofErr w:type="spellStart"/>
+      <w:r>
+        <w:rPr>
+          <w:color w:val="0F172A"/>
+        </w:rPr>
+        <w:t>modalı</w:t>
+      </w:r>
+      <w:proofErr w:type="spellEnd"/>
+      <w:r>
+        <w:rPr>
+          <w:color w:val="0F172A"/>
+        </w:rPr>
+        <w:t xml:space="preserve"> var mı?</w:t>
       </w:r>
     </w:p>
     <w:p>
@@ -7951,7 +9748,21 @@
         <w:rPr>
           <w:color w:val="0F172A"/>
         </w:rPr>
-        <w:t>Devre dışı elemanların tooltip'i yazıldı mı?</w:t>
+        <w:t xml:space="preserve">Devre dışı elemanların </w:t>
+      </w:r>
+      <w:proofErr w:type="spellStart"/>
+      <w:r>
+        <w:rPr>
+          <w:color w:val="0F172A"/>
+        </w:rPr>
+        <w:t>tooltip'i</w:t>
+      </w:r>
+      <w:proofErr w:type="spellEnd"/>
+      <w:r>
+        <w:rPr>
+          <w:color w:val="0F172A"/>
+        </w:rPr>
+        <w:t xml:space="preserve"> yazıldı mı?</w:t>
       </w:r>
     </w:p>
     <w:p>
@@ -7979,11 +9790,19 @@
         </w:numPr>
         <w:spacing w:before="40" w:after="40"/>
       </w:pPr>
-      <w:r>
-        <w:rPr>
-          <w:color w:val="0F172A"/>
-        </w:rPr>
-        <w:t>Undo her önemli aksiyonda çalışıyor mu?</w:t>
+      <w:proofErr w:type="spellStart"/>
+      <w:r>
+        <w:rPr>
+          <w:color w:val="0F172A"/>
+        </w:rPr>
+        <w:t>Undo</w:t>
+      </w:r>
+      <w:proofErr w:type="spellEnd"/>
+      <w:r>
+        <w:rPr>
+          <w:color w:val="0F172A"/>
+        </w:rPr>
+        <w:t xml:space="preserve"> her önemli aksiyonda çalışıyor mu?</w:t>
       </w:r>
     </w:p>
     <w:p>
@@ -8007,6 +9826,7 @@
       <w:pPr>
         <w:jc w:val="center"/>
       </w:pPr>
+      <w:proofErr w:type="spellStart"/>
       <w:r>
         <w:rPr>
           <w:i/>
@@ -8015,7 +9835,62 @@
           <w:sz w:val="18"/>
           <w:szCs w:val="18"/>
         </w:rPr>
-        <w:t>Presserdiado UX/UI Kılavuzu  ·  v2.0  ·  Mayıs 2026</w:t>
+        <w:t>Presserdiado</w:t>
+      </w:r>
+      <w:proofErr w:type="spellEnd"/>
+      <w:r>
+        <w:rPr>
+          <w:i/>
+          <w:iCs/>
+          <w:color w:val="475569"/>
+          <w:sz w:val="18"/>
+          <w:szCs w:val="18"/>
+        </w:rPr>
+        <w:t xml:space="preserve"> UX/UI </w:t>
+      </w:r>
+      <w:proofErr w:type="gramStart"/>
+      <w:r>
+        <w:rPr>
+          <w:i/>
+          <w:iCs/>
+          <w:color w:val="475569"/>
+          <w:sz w:val="18"/>
+          <w:szCs w:val="18"/>
+        </w:rPr>
+        <w:t>Kılavuzu  ·</w:t>
+      </w:r>
+      <w:proofErr w:type="gramEnd"/>
+      <w:r>
+        <w:rPr>
+          <w:i/>
+          <w:iCs/>
+          <w:color w:val="475569"/>
+          <w:sz w:val="18"/>
+          <w:szCs w:val="18"/>
+        </w:rPr>
+        <w:t xml:space="preserve">  </w:t>
+      </w:r>
+      <w:proofErr w:type="gramStart"/>
+      <w:r>
+        <w:rPr>
+          <w:i/>
+          <w:iCs/>
+          <w:color w:val="475569"/>
+          <w:sz w:val="18"/>
+          <w:szCs w:val="18"/>
+        </w:rPr>
+        <w:t>v2.0  ·</w:t>
+      </w:r>
+      <w:proofErr w:type="gramEnd"/>
+      <w:r>
+        <w:rPr>
+          <w:i/>
+          <w:iCs/>
+          <w:color w:val="475569"/>
+          <w:sz w:val="18"/>
+          <w:szCs w:val="18"/>
+        </w:rPr>
+        <w:t xml:space="preserve">  Mayıs 2026</w:t>
       </w:r>
     </w:p>
     <w:sectPr>
@@ -8678,7 +10553,6 @@
   <w:style w:type="character" w:default="1" w:styleId="VarsaylanParagrafYazTipi">
     <w:name w:val="Default Paragraph Font"/>
     <w:uiPriority w:val="1"/>
-    <w:semiHidden/>
     <w:unhideWhenUsed/>
   </w:style>
   <w:style w:type="table" w:default="1" w:styleId="NormalTablo">

</xml_diff>